<commit_message>
Phase 2: finalize standalone master documentation
</commit_message>
<xml_diff>
--- a/00_PROJECT_DOCUMENTATION/Phase_2_Core_Application_Skeleton/NOVYRA_OS_Phase_2_Master_Documentation.docx
+++ b/00_PROJECT_DOCUMENTATION/Phase_2_Core_Application_Skeleton/NOVYRA_OS_Phase_2_Master_Documentation.docx
@@ -9,7 +9,7 @@
       <w:r>
         <w:rPr>
           <w:b/>
-          <w:sz w:val="44"/>
+          <w:sz w:val="56"/>
         </w:rPr>
         <w:t>NOVYRA OS</w:t>
       </w:r>
@@ -21,9 +21,9 @@
       <w:r>
         <w:rPr>
           <w:b/>
-          <w:sz w:val="32"/>
+          <w:sz w:val="36"/>
         </w:rPr>
-        <w:t>Phase 2 — Core Application Skeleton &amp; Implementation Foundation</w:t>
+        <w:t>PHASE 2 MASTER DOCUMENTATION</w:t>
       </w:r>
     </w:p>
     <w:p>
@@ -33,34 +33,54 @@
       <w:r>
         <w:rPr>
           <w:i/>
-          <w:sz w:val="21"/>
+          <w:sz w:val="26"/>
         </w:rPr>
-        <w:t>Master documentation prepared before implementation begins</w:t>
-      </w:r>
-    </w:p>
-    <w:p/>
-    <w:p>
-      <w:pPr>
-        <w:pStyle w:val="Heading1"/>
-      </w:pPr>
-      <w:r>
-        <w:t>Document Control</w:t>
+        <w:t>Core Application Skeleton</w:t>
       </w:r>
     </w:p>
     <w:tbl>
       <w:tblPr>
         <w:tblStyle w:val="TableGrid"/>
         <w:tblW w:type="auto" w:w="0"/>
+        <w:jc w:val="center"/>
         <w:tblLook w:firstColumn="1" w:firstRow="1" w:lastColumn="0" w:lastRow="0" w:noHBand="0" w:noVBand="1" w:val="04A0"/>
       </w:tblPr>
       <w:tblGrid>
-        <w:gridCol w:w="4824"/>
-        <w:gridCol w:w="4824"/>
+        <w:gridCol w:w="4968"/>
+        <w:gridCol w:w="4968"/>
       </w:tblGrid>
       <w:tr>
         <w:tc>
           <w:tcPr>
-            <w:tcW w:type="dxa" w:w="4824"/>
+            <w:tcW w:type="dxa" w:w="4968"/>
+          </w:tcPr>
+          <w:p>
+            <w:r>
+              <w:rPr>
+                <w:b/>
+              </w:rPr>
+              <w:t>Document Property</w:t>
+            </w:r>
+          </w:p>
+        </w:tc>
+        <w:tc>
+          <w:tcPr>
+            <w:tcW w:type="dxa" w:w="4968"/>
+          </w:tcPr>
+          <w:p>
+            <w:r>
+              <w:rPr>
+                <w:b/>
+              </w:rPr>
+              <w:t>Value</w:t>
+            </w:r>
+          </w:p>
+        </w:tc>
+      </w:tr>
+      <w:tr>
+        <w:tc>
+          <w:tcPr>
+            <w:tcW w:type="dxa" w:w="4968"/>
           </w:tcPr>
           <w:p>
             <w:r>
@@ -70,7 +90,7 @@
         </w:tc>
         <w:tc>
           <w:tcPr>
-            <w:tcW w:type="dxa" w:w="4824"/>
+            <w:tcW w:type="dxa" w:w="4968"/>
           </w:tcPr>
           <w:p>
             <w:r>
@@ -82,7 +102,7 @@
       <w:tr>
         <w:tc>
           <w:tcPr>
-            <w:tcW w:type="dxa" w:w="4824"/>
+            <w:tcW w:type="dxa" w:w="4968"/>
           </w:tcPr>
           <w:p>
             <w:r>
@@ -92,11 +112,11 @@
         </w:tc>
         <w:tc>
           <w:tcPr>
-            <w:tcW w:type="dxa" w:w="4824"/>
+            <w:tcW w:type="dxa" w:w="4968"/>
           </w:tcPr>
           <w:p>
             <w:r>
-              <w:t>Phase 2 — Core Application Skeleton &amp; Implementation Foundation</w:t>
+              <w:t>Phase 2 — Core Application Skeleton</w:t>
             </w:r>
           </w:p>
         </w:tc>
@@ -104,21 +124,21 @@
       <w:tr>
         <w:tc>
           <w:tcPr>
-            <w:tcW w:type="dxa" w:w="4824"/>
+            <w:tcW w:type="dxa" w:w="4968"/>
           </w:tcPr>
           <w:p>
             <w:r>
-              <w:t>Purpose</w:t>
+              <w:t>Version</w:t>
             </w:r>
           </w:p>
         </w:tc>
         <w:tc>
           <w:tcPr>
-            <w:tcW w:type="dxa" w:w="4824"/>
+            <w:tcW w:type="dxa" w:w="4968"/>
           </w:tcPr>
           <w:p>
             <w:r>
-              <w:t>Provide the official written baseline for how NOVYRA OS will be built from the repository foundation into a maintainable Python application.</w:t>
+              <w:t>0.2.0</w:t>
             </w:r>
           </w:p>
         </w:tc>
@@ -126,21 +146,21 @@
       <w:tr>
         <w:tc>
           <w:tcPr>
-            <w:tcW w:type="dxa" w:w="4824"/>
+            <w:tcW w:type="dxa" w:w="4968"/>
           </w:tcPr>
           <w:p>
             <w:r>
-              <w:t>Audience</w:t>
+              <w:t>Documentation Type</w:t>
             </w:r>
           </w:p>
         </w:tc>
         <w:tc>
           <w:tcPr>
-            <w:tcW w:type="dxa" w:w="4824"/>
+            <w:tcW w:type="dxa" w:w="4968"/>
           </w:tcPr>
           <w:p>
             <w:r>
-              <w:t>Project owner, future contributors, and the implementation record.</w:t>
+              <w:t>Phase Master Documentation</w:t>
             </w:r>
           </w:p>
         </w:tc>
@@ -148,7 +168,7 @@
       <w:tr>
         <w:tc>
           <w:tcPr>
-            <w:tcW w:type="dxa" w:w="4824"/>
+            <w:tcW w:type="dxa" w:w="4968"/>
           </w:tcPr>
           <w:p>
             <w:r>
@@ -158,11 +178,11 @@
         </w:tc>
         <w:tc>
           <w:tcPr>
-            <w:tcW w:type="dxa" w:w="4824"/>
+            <w:tcW w:type="dxa" w:w="4968"/>
           </w:tcPr>
           <w:p>
             <w:r>
-              <w:t>Drafted before build-out</w:t>
+              <w:t>Implementation verified</w:t>
             </w:r>
           </w:p>
         </w:tc>
@@ -170,21 +190,224 @@
       <w:tr>
         <w:tc>
           <w:tcPr>
-            <w:tcW w:type="dxa" w:w="4824"/>
+            <w:tcW w:type="dxa" w:w="4968"/>
           </w:tcPr>
           <w:p>
             <w:r>
-              <w:t>Version</w:t>
+              <w:t>Primary Branch</w:t>
             </w:r>
           </w:p>
         </w:tc>
         <w:tc>
           <w:tcPr>
-            <w:tcW w:type="dxa" w:w="4824"/>
+            <w:tcW w:type="dxa" w:w="4968"/>
+          </w:tcPr>
+          <w:p>
+            <w:r>
+              <w:t>main</w:t>
+            </w:r>
+          </w:p>
+        </w:tc>
+      </w:tr>
+      <w:tr>
+        <w:tc>
+          <w:tcPr>
+            <w:tcW w:type="dxa" w:w="4968"/>
+          </w:tcPr>
+          <w:p>
+            <w:r>
+              <w:t>Remote Repository</w:t>
+            </w:r>
+          </w:p>
+        </w:tc>
+        <w:tc>
+          <w:tcPr>
+            <w:tcW w:type="dxa" w:w="4968"/>
+          </w:tcPr>
+          <w:p>
+            <w:r>
+              <w:t>https://github.com/Mthuda/NOVYRA_OS.git</w:t>
+            </w:r>
+          </w:p>
+        </w:tc>
+      </w:tr>
+      <w:tr>
+        <w:tc>
+          <w:tcPr>
+            <w:tcW w:type="dxa" w:w="4968"/>
+          </w:tcPr>
+          <w:p>
+            <w:r>
+              <w:t>Platform</w:t>
+            </w:r>
+          </w:p>
+        </w:tc>
+        <w:tc>
+          <w:tcPr>
+            <w:tcW w:type="dxa" w:w="4968"/>
+          </w:tcPr>
+          <w:p>
+            <w:r>
+              <w:t>Windows / PowerShell</w:t>
+            </w:r>
+          </w:p>
+        </w:tc>
+      </w:tr>
+      <w:tr>
+        <w:tc>
+          <w:tcPr>
+            <w:tcW w:type="dxa" w:w="4968"/>
+          </w:tcPr>
+          <w:p>
+            <w:r>
+              <w:t>Python Environment</w:t>
+            </w:r>
+          </w:p>
+        </w:tc>
+        <w:tc>
+          <w:tcPr>
+            <w:tcW w:type="dxa" w:w="4968"/>
+          </w:tcPr>
+          <w:p>
+            <w:r>
+              <w:t>.venv</w:t>
+            </w:r>
+          </w:p>
+        </w:tc>
+      </w:tr>
+      <w:tr>
+        <w:tc>
+          <w:tcPr>
+            <w:tcW w:type="dxa" w:w="4968"/>
+          </w:tcPr>
+          <w:p>
+            <w:r>
+              <w:t>Test Framework</w:t>
+            </w:r>
+          </w:p>
+        </w:tc>
+        <w:tc>
+          <w:tcPr>
+            <w:tcW w:type="dxa" w:w="4968"/>
+          </w:tcPr>
+          <w:p>
+            <w:r>
+              <w:t>pytest 9.1.1</w:t>
+            </w:r>
+          </w:p>
+        </w:tc>
+      </w:tr>
+    </w:tbl>
+    <w:p>
+      <w:pPr>
+        <w:jc w:val="center"/>
+      </w:pPr>
+      <w:r>
+        <w:rPr>
+          <w:i/>
+        </w:rPr>
+        <w:t>Official standalone Phase 2 project record.</w:t>
+      </w:r>
+    </w:p>
+    <w:p>
+      <w:r>
+        <w:br w:type="page"/>
+      </w:r>
+    </w:p>
+    <w:p>
+      <w:pPr>
+        <w:pStyle w:val="Heading1"/>
+      </w:pPr>
+      <w:r>
+        <w:t>Document Control</w:t>
+      </w:r>
+    </w:p>
+    <w:p>
+      <w:r>
+        <w:t>This standalone master document records the architecture, implementation, testing, verification, engineering decisions, problems, and Git checkpoints completed during Phase 2. Going forward, every NOVYRA OS phase will maintain its own dedicated master documentation file.</w:t>
+      </w:r>
+    </w:p>
+    <w:tbl>
+      <w:tblPr>
+        <w:tblStyle w:val="TableGrid"/>
+        <w:tblW w:type="auto" w:w="0"/>
+        <w:jc w:val="center"/>
+        <w:tblLook w:firstColumn="1" w:firstRow="1" w:lastColumn="0" w:lastRow="0" w:noHBand="0" w:noVBand="1" w:val="04A0"/>
+      </w:tblPr>
+      <w:tblGrid>
+        <w:gridCol w:w="3312"/>
+        <w:gridCol w:w="3312"/>
+        <w:gridCol w:w="3312"/>
+      </w:tblGrid>
+      <w:tr>
+        <w:tc>
+          <w:tcPr>
+            <w:tcW w:type="dxa" w:w="3312"/>
+          </w:tcPr>
+          <w:p>
+            <w:r>
+              <w:rPr>
+                <w:b/>
+              </w:rPr>
+              <w:t>Revision</w:t>
+            </w:r>
+          </w:p>
+        </w:tc>
+        <w:tc>
+          <w:tcPr>
+            <w:tcW w:type="dxa" w:w="3312"/>
+          </w:tcPr>
+          <w:p>
+            <w:r>
+              <w:rPr>
+                <w:b/>
+              </w:rPr>
+              <w:t>Status</w:t>
+            </w:r>
+          </w:p>
+        </w:tc>
+        <w:tc>
+          <w:tcPr>
+            <w:tcW w:type="dxa" w:w="3312"/>
+          </w:tcPr>
+          <w:p>
+            <w:r>
+              <w:rPr>
+                <w:b/>
+              </w:rPr>
+              <w:t>Description</w:t>
+            </w:r>
+          </w:p>
+        </w:tc>
+      </w:tr>
+      <w:tr>
+        <w:tc>
+          <w:tcPr>
+            <w:tcW w:type="dxa" w:w="3312"/>
           </w:tcPr>
           <w:p>
             <w:r>
               <w:t>1.0</w:t>
+            </w:r>
+          </w:p>
+        </w:tc>
+        <w:tc>
+          <w:tcPr>
+            <w:tcW w:type="dxa" w:w="3312"/>
+          </w:tcPr>
+          <w:p>
+            <w:r>
+              <w:t>Initial Phase 2 master record</w:t>
+            </w:r>
+          </w:p>
+        </w:tc>
+        <w:tc>
+          <w:tcPr>
+            <w:tcW w:type="dxa" w:w="3312"/>
+          </w:tcPr>
+          <w:p>
+            <w:r>
+              <w:t>Consolidated record of the Phase 2 implementation completed to date.</w:t>
             </w:r>
           </w:p>
         </w:tc>
@@ -195,12 +418,17 @@
         <w:pStyle w:val="Heading1"/>
       </w:pPr>
       <w:r>
-        <w:t>1. Purpose of Phase 2</w:t>
+        <w:t>Phase 2 Executive Summary</w:t>
       </w:r>
     </w:p>
     <w:p>
       <w:r>
-        <w:t>Phase 2 turns the repository baseline into a real application skeleton. The goal is not to build every NOVYRA OS capability at once. The goal is to establish a clean, testable, and extensible Python foundation that future phases can build on without rework.</w:t>
+        <w:t>Phase 2 established the foundational Python application skeleton for NOVYRA OS. The project moved from a basic repository structure into a structured application with centralized configuration, project metadata, path utilities, logging initialization, a service layer, a standardized ServiceResult contract, automated tests, environment templates, and a verified application entry point.</w:t>
+      </w:r>
+    </w:p>
+    <w:p>
+      <w:r>
+        <w:t>The implementation was developed incrementally and validated after major architectural additions. The recorded final verification state shows 23 automated tests passing, successful application startup, and a clean Git working tree after the latest committed checkpoint.</w:t>
       </w:r>
     </w:p>
     <w:p>
@@ -208,12 +436,95 @@
         <w:pStyle w:val="Heading1"/>
       </w:pPr>
       <w:r>
-        <w:t>2. What Phase 2 Must Deliver</w:t>
+        <w:t>1. Objectives and Scope</w:t>
       </w:r>
     </w:p>
     <w:p>
+      <w:pPr>
+        <w:pStyle w:val="ListBullet"/>
+      </w:pPr>
       <w:r>
-        <w:t>This phase must produce the minimum architectural shape required for the system to grow safely. It should establish application entry points, package boundaries, configuration handling, basic logging, dependency management, and the first testable code structure.</w:t>
+        <w:t>Create a maintainable Python application source-code skeleton.</w:t>
+      </w:r>
+    </w:p>
+    <w:p>
+      <w:pPr>
+        <w:pStyle w:val="ListBullet"/>
+      </w:pPr>
+      <w:r>
+        <w:t>Separate core infrastructure, services, models, utilities, and tests.</w:t>
+      </w:r>
+    </w:p>
+    <w:p>
+      <w:pPr>
+        <w:pStyle w:val="ListBullet"/>
+      </w:pPr>
+      <w:r>
+        <w:t>Centralize application configuration through environment variables.</w:t>
+      </w:r>
+    </w:p>
+    <w:p>
+      <w:pPr>
+        <w:pStyle w:val="ListBullet"/>
+      </w:pPr>
+      <w:r>
+        <w:t>Introduce reusable project metadata and project-root path utilities.</w:t>
+      </w:r>
+    </w:p>
+    <w:p>
+      <w:pPr>
+        <w:pStyle w:val="ListBullet"/>
+      </w:pPr>
+      <w:r>
+        <w:t>Establish application logging initialization.</w:t>
+      </w:r>
+    </w:p>
+    <w:p>
+      <w:pPr>
+        <w:pStyle w:val="ListBullet"/>
+      </w:pPr>
+      <w:r>
+        <w:t>Introduce a dedicated service layer.</w:t>
+      </w:r>
+    </w:p>
+    <w:p>
+      <w:pPr>
+        <w:pStyle w:val="ListBullet"/>
+      </w:pPr>
+      <w:r>
+        <w:t>Create a consistent ServiceResult contract for service operations.</w:t>
+      </w:r>
+    </w:p>
+    <w:p>
+      <w:pPr>
+        <w:pStyle w:val="ListBullet"/>
+      </w:pPr>
+      <w:r>
+        <w:t>Establish automated testing with pytest.</w:t>
+      </w:r>
+    </w:p>
+    <w:p>
+      <w:pPr>
+        <w:pStyle w:val="ListBullet"/>
+      </w:pPr>
+      <w:r>
+        <w:t>Provide development and production environment templates without secrets.</w:t>
+      </w:r>
+    </w:p>
+    <w:p>
+      <w:pPr>
+        <w:pStyle w:val="ListBullet"/>
+      </w:pPr>
+      <w:r>
+        <w:t>Integrate the architecture into the main application entry point.</w:t>
+      </w:r>
+    </w:p>
+    <w:p>
+      <w:pPr>
+        <w:pStyle w:val="ListBullet"/>
+      </w:pPr>
+      <w:r>
+        <w:t>Maintain documentation and Git checkpoints throughout the phase.</w:t>
       </w:r>
     </w:p>
     <w:p>
@@ -221,12 +532,80 @@
         <w:pStyle w:val="Heading1"/>
       </w:pPr>
       <w:r>
-        <w:t>3. What Phase 2 Does Not Include</w:t>
+        <w:t>2. Phase 2 Architecture</w:t>
       </w:r>
     </w:p>
     <w:p>
       <w:r>
-        <w:t>This phase does not attempt to finish the database, APIs, AI features, automation workflows, or deployment infrastructure. Those belong to later phases. Phase 2 is about architecture discipline, not feature sprawl.</w:t>
+        <w:t>The architecture separates application startup, configuration, core infrastructure, service operations, and testing. It is intentionally lightweight so future phases can add persistence, APIs, domain logic, integrations, and user-facing functionality without restructuring the foundation.</w:t>
+      </w:r>
+    </w:p>
+    <w:p>
+      <w:pPr>
+        <w:ind w:left="360"/>
+      </w:pPr>
+      <w:r>
+        <w:rPr>
+          <w:rFonts w:ascii="Consolas" w:hAnsi="Consolas"/>
+          <w:sz w:val="18"/>
+        </w:rPr>
+        <w:t>NOVYRA_OS/</w:t>
+        <w:br/>
+        <w:t>├── 00_PROJECT_DOCUMENTATION/</w:t>
+        <w:br/>
+        <w:t>│   └── Phase_2_Core_Application_Skeleton/</w:t>
+        <w:br/>
+        <w:t>│       └── NOVYRA_OS_Phase_2_Master_Documentation.docx</w:t>
+        <w:br/>
+        <w:t>├── 02_SOURCE_CODE/</w:t>
+        <w:br/>
+        <w:t>│   ├── app/</w:t>
+        <w:br/>
+        <w:t>│   │   ├── core/</w:t>
+        <w:br/>
+        <w:t>│   │   │   ├── config.py</w:t>
+        <w:br/>
+        <w:t>│   │   │   ├── logging_setup.py</w:t>
+        <w:br/>
+        <w:t>│   │   │   ├── paths.py</w:t>
+        <w:br/>
+        <w:t>│   │   │   ├── project_info.py</w:t>
+        <w:br/>
+        <w:t>│   │   │   └── service_result.py</w:t>
+        <w:br/>
+        <w:t>│   │   ├── models/</w:t>
+        <w:br/>
+        <w:t>│   │   ├── services/</w:t>
+        <w:br/>
+        <w:t>│   │   │   └── system_service.py</w:t>
+        <w:br/>
+        <w:t>│   │   ├── utils/</w:t>
+        <w:br/>
+        <w:t>│   │   └── main.py</w:t>
+        <w:br/>
+        <w:t>│   └── tests/</w:t>
+        <w:br/>
+        <w:t>│       ├── test_smoke.py</w:t>
+        <w:br/>
+        <w:t>│       ├── test_config.py</w:t>
+        <w:br/>
+        <w:t>│       ├── test_system_service.py</w:t>
+        <w:br/>
+        <w:t>│       └── test_service_result.py</w:t>
+        <w:br/>
+        <w:t>├── 04_CONFIGURATION/</w:t>
+        <w:br/>
+        <w:t>│   └── environment/</w:t>
+        <w:br/>
+        <w:t>│       ├── development.env.example</w:t>
+        <w:br/>
+        <w:t>│       └── production.env.example</w:t>
+        <w:br/>
+        <w:t>├── .env.example</w:t>
+        <w:br/>
+        <w:t>├── README.md</w:t>
+        <w:br/>
+        <w:t>└── requirements.txt</w:t>
       </w:r>
     </w:p>
     <w:p>
@@ -234,558 +613,44 @@
         <w:pStyle w:val="Heading1"/>
       </w:pPr>
       <w:r>
-        <w:t>4. Phase 2 Scope</w:t>
-      </w:r>
-    </w:p>
-    <w:p>
-      <w:r>
-        <w:t>The scope is intentionally narrow and practical. It covers the following work items:</w:t>
-      </w:r>
-    </w:p>
-    <w:p>
-      <w:pPr>
-        <w:pStyle w:val="ListBullet"/>
-      </w:pPr>
-      <w:r>
-        <w:t>Refine the source tree into a maintainable Python application layout.</w:t>
-      </w:r>
-    </w:p>
-    <w:p>
-      <w:pPr>
-        <w:pStyle w:val="ListBullet"/>
-      </w:pPr>
-      <w:r>
-        <w:t>Add a requirements file or dependency manifest.</w:t>
-      </w:r>
-    </w:p>
-    <w:p>
-      <w:pPr>
-        <w:pStyle w:val="ListBullet"/>
-      </w:pPr>
-      <w:r>
-        <w:t>Create a proper application entry point.</w:t>
-      </w:r>
-    </w:p>
-    <w:p>
-      <w:pPr>
-        <w:pStyle w:val="ListBullet"/>
-      </w:pPr>
-      <w:r>
-        <w:t>Create reusable core modules for configuration, logging, and helpers.</w:t>
-      </w:r>
-    </w:p>
-    <w:p>
-      <w:pPr>
-        <w:pStyle w:val="ListBullet"/>
-      </w:pPr>
-      <w:r>
-        <w:t>Define the first test structure and test execution pattern.</w:t>
-      </w:r>
-    </w:p>
-    <w:p>
-      <w:pPr>
-        <w:pStyle w:val="ListBullet"/>
-      </w:pPr>
-      <w:r>
-        <w:t>Establish configuration file handling and environment variable usage.</w:t>
-      </w:r>
-    </w:p>
-    <w:p>
-      <w:pPr>
-        <w:pStyle w:val="ListBullet"/>
-      </w:pPr>
-      <w:r>
-        <w:t>Add a repeatable developer workflow for running the project in VS Code.</w:t>
-      </w:r>
-    </w:p>
-    <w:p>
-      <w:pPr>
-        <w:pStyle w:val="ListBullet"/>
-      </w:pPr>
-      <w:r>
-        <w:t>Document decisions in the project log and documentation folders.</w:t>
-      </w:r>
-    </w:p>
-    <w:p>
-      <w:pPr>
-        <w:pStyle w:val="Heading1"/>
-      </w:pPr>
-      <w:r>
-        <w:t>5. Reference Project Structure for Phase 2</w:t>
-      </w:r>
-    </w:p>
-    <w:p>
-      <w:r>
-        <w:t>The project already has a strong repository foundation. Phase 2 should reinforce that structure rather than replacing it unnecessarily.</w:t>
-      </w:r>
-    </w:p>
-    <w:p>
-      <w:r>
-        <w:rPr>
-          <w:rFonts w:ascii="Consolas" w:hAnsi="Consolas"/>
-          <w:sz w:val="19"/>
-        </w:rPr>
-        <w:t>NOVYRA_OS/</w:t>
-        <w:br/>
-      </w:r>
-      <w:r>
-        <w:rPr>
-          <w:rFonts w:ascii="Consolas" w:hAnsi="Consolas"/>
-          <w:sz w:val="19"/>
-        </w:rPr>
-        <w:t>├── .git/</w:t>
-        <w:br/>
-      </w:r>
-      <w:r>
-        <w:rPr>
-          <w:rFonts w:ascii="Consolas" w:hAnsi="Consolas"/>
-          <w:sz w:val="19"/>
-        </w:rPr>
-        <w:t>├── .gitignore</w:t>
-        <w:br/>
-      </w:r>
-      <w:r>
-        <w:rPr>
-          <w:rFonts w:ascii="Consolas" w:hAnsi="Consolas"/>
-          <w:sz w:val="19"/>
-        </w:rPr>
-        <w:t>├── .vscode/</w:t>
-        <w:br/>
-      </w:r>
-      <w:r>
-        <w:rPr>
-          <w:rFonts w:ascii="Consolas" w:hAnsi="Consolas"/>
-          <w:sz w:val="19"/>
-        </w:rPr>
-        <w:t>├── 00_PROJECT_DOCUMENTATION/</w:t>
-        <w:br/>
-      </w:r>
-      <w:r>
-        <w:rPr>
-          <w:rFonts w:ascii="Consolas" w:hAnsi="Consolas"/>
-          <w:sz w:val="19"/>
-        </w:rPr>
-        <w:t>├── 01_LEARNING_JOURNEY/</w:t>
-        <w:br/>
-      </w:r>
-      <w:r>
-        <w:rPr>
-          <w:rFonts w:ascii="Consolas" w:hAnsi="Consolas"/>
-          <w:sz w:val="19"/>
-        </w:rPr>
-        <w:t>├── 02_SOURCE_CODE/</w:t>
-        <w:br/>
-      </w:r>
-      <w:r>
-        <w:rPr>
-          <w:rFonts w:ascii="Consolas" w:hAnsi="Consolas"/>
-          <w:sz w:val="19"/>
-        </w:rPr>
-        <w:t>│   ├── app/</w:t>
-        <w:br/>
-      </w:r>
-      <w:r>
-        <w:rPr>
-          <w:rFonts w:ascii="Consolas" w:hAnsi="Consolas"/>
-          <w:sz w:val="19"/>
-        </w:rPr>
-        <w:t>│   │   ├── main.py</w:t>
-        <w:br/>
-      </w:r>
-      <w:r>
-        <w:rPr>
-          <w:rFonts w:ascii="Consolas" w:hAnsi="Consolas"/>
-          <w:sz w:val="19"/>
-        </w:rPr>
-        <w:t>│   │   └── core/</w:t>
-        <w:br/>
-      </w:r>
-      <w:r>
-        <w:rPr>
-          <w:rFonts w:ascii="Consolas" w:hAnsi="Consolas"/>
-          <w:sz w:val="19"/>
-        </w:rPr>
-        <w:t>│   └── tests/</w:t>
-        <w:br/>
-      </w:r>
-      <w:r>
-        <w:rPr>
-          <w:rFonts w:ascii="Consolas" w:hAnsi="Consolas"/>
-          <w:sz w:val="19"/>
-        </w:rPr>
-        <w:t>├── 03_DATABASE/</w:t>
-        <w:br/>
-      </w:r>
-      <w:r>
-        <w:rPr>
-          <w:rFonts w:ascii="Consolas" w:hAnsi="Consolas"/>
-          <w:sz w:val="19"/>
-        </w:rPr>
-        <w:t>├── 04_CONFIGURATION/</w:t>
-        <w:br/>
-      </w:r>
-      <w:r>
-        <w:rPr>
-          <w:rFonts w:ascii="Consolas" w:hAnsi="Consolas"/>
-          <w:sz w:val="19"/>
-        </w:rPr>
-        <w:t>├── 05_TESTING/</w:t>
-        <w:br/>
-      </w:r>
-      <w:r>
-        <w:rPr>
-          <w:rFonts w:ascii="Consolas" w:hAnsi="Consolas"/>
-          <w:sz w:val="19"/>
-        </w:rPr>
-        <w:t>├── 06_DOCUMENTATION/</w:t>
-        <w:br/>
-      </w:r>
-      <w:r>
-        <w:rPr>
-          <w:rFonts w:ascii="Consolas" w:hAnsi="Consolas"/>
-          <w:sz w:val="19"/>
-        </w:rPr>
-        <w:t>├── 07_PROJECT_LOG/</w:t>
-        <w:br/>
-      </w:r>
-      <w:r>
-        <w:rPr>
-          <w:rFonts w:ascii="Consolas" w:hAnsi="Consolas"/>
-          <w:sz w:val="19"/>
-        </w:rPr>
-        <w:t>└── 08_BACKUPS/</w:t>
-        <w:br/>
-      </w:r>
-    </w:p>
-    <w:p>
-      <w:pPr>
-        <w:pStyle w:val="Heading1"/>
-      </w:pPr>
-      <w:r>
-        <w:t>6. Engineering Standards to Follow</w:t>
-      </w:r>
-    </w:p>
-    <w:p>
-      <w:pPr>
-        <w:pStyle w:val="ListBullet"/>
-      </w:pPr>
-      <w:r>
-        <w:t>Keep code small, readable, and modular.</w:t>
-      </w:r>
-    </w:p>
-    <w:p>
-      <w:pPr>
-        <w:pStyle w:val="ListBullet"/>
-      </w:pPr>
-      <w:r>
-        <w:t>Use descriptive file and folder names.</w:t>
-      </w:r>
-    </w:p>
-    <w:p>
-      <w:pPr>
-        <w:pStyle w:val="ListBullet"/>
-      </w:pPr>
-      <w:r>
-        <w:t>Avoid unnecessary abstraction.</w:t>
-      </w:r>
-    </w:p>
-    <w:p>
-      <w:pPr>
-        <w:pStyle w:val="ListBullet"/>
-      </w:pPr>
-      <w:r>
-        <w:t>Do not hard-code secrets.</w:t>
-      </w:r>
-    </w:p>
-    <w:p>
-      <w:pPr>
-        <w:pStyle w:val="ListBullet"/>
-      </w:pPr>
-      <w:r>
-        <w:t>Use the virtual environment for project dependencies.</w:t>
-      </w:r>
-    </w:p>
-    <w:p>
-      <w:pPr>
-        <w:pStyle w:val="ListBullet"/>
-      </w:pPr>
-      <w:r>
-        <w:t>Write code that can be tested before it is trusted.</w:t>
-      </w:r>
-    </w:p>
-    <w:p>
-      <w:pPr>
-        <w:pStyle w:val="ListBullet"/>
-      </w:pPr>
-      <w:r>
-        <w:t>Treat configuration as data, not logic.</w:t>
-      </w:r>
-    </w:p>
-    <w:p>
-      <w:pPr>
-        <w:pStyle w:val="ListBullet"/>
-      </w:pPr>
-      <w:r>
-        <w:t>Preserve the repository as the source of truth.</w:t>
-      </w:r>
-    </w:p>
-    <w:p>
-      <w:pPr>
-        <w:pStyle w:val="Heading1"/>
-      </w:pPr>
-      <w:r>
-        <w:t>7. Build Order for Phase 2</w:t>
-      </w:r>
-    </w:p>
-    <w:p>
-      <w:pPr>
-        <w:pStyle w:val="ListBullet"/>
-      </w:pPr>
-      <w:r>
-        <w:t>Confirm the current repository state and branch.</w:t>
-      </w:r>
-    </w:p>
-    <w:p>
-      <w:pPr>
-        <w:pStyle w:val="ListBullet"/>
-      </w:pPr>
-      <w:r>
-        <w:t>Review and refine the source folder structure.</w:t>
-      </w:r>
-    </w:p>
-    <w:p>
-      <w:pPr>
-        <w:pStyle w:val="ListBullet"/>
-      </w:pPr>
-      <w:r>
-        <w:t>Create a dependency manifest.</w:t>
-      </w:r>
-    </w:p>
-    <w:p>
-      <w:pPr>
-        <w:pStyle w:val="ListBullet"/>
-      </w:pPr>
-      <w:r>
-        <w:t>Add the application skeleton and entry point.</w:t>
-      </w:r>
-    </w:p>
-    <w:p>
-      <w:pPr>
-        <w:pStyle w:val="ListBullet"/>
-      </w:pPr>
-      <w:r>
-        <w:t>Add reusable configuration and logging modules.</w:t>
-      </w:r>
-    </w:p>
-    <w:p>
-      <w:pPr>
-        <w:pStyle w:val="ListBullet"/>
-      </w:pPr>
-      <w:r>
-        <w:t>Add the first automated tests.</w:t>
-      </w:r>
-    </w:p>
-    <w:p>
-      <w:pPr>
-        <w:pStyle w:val="ListBullet"/>
-      </w:pPr>
-      <w:r>
-        <w:t>Run the application from VS Code and the terminal.</w:t>
-      </w:r>
-    </w:p>
-    <w:p>
-      <w:pPr>
-        <w:pStyle w:val="ListBullet"/>
-      </w:pPr>
-      <w:r>
-        <w:t>Verify that the structure is reproducible on the same machine.</w:t>
-      </w:r>
-    </w:p>
-    <w:p>
-      <w:pPr>
-        <w:pStyle w:val="ListBullet"/>
-      </w:pPr>
-      <w:r>
-        <w:t>Document the outcome and commit the phase baseline.</w:t>
-      </w:r>
-    </w:p>
-    <w:p>
-      <w:pPr>
-        <w:pStyle w:val="Heading1"/>
-      </w:pPr>
-      <w:r>
-        <w:t>8. Dependency Strategy</w:t>
-      </w:r>
-    </w:p>
-    <w:p>
-      <w:pPr>
-        <w:pStyle w:val="ListBullet"/>
-      </w:pPr>
-      <w:r>
-        <w:t>Only install packages that solve a real project need.</w:t>
-      </w:r>
-    </w:p>
-    <w:p>
-      <w:pPr>
-        <w:pStyle w:val="ListBullet"/>
-      </w:pPr>
-      <w:r>
-        <w:t>Keep the dependency list short and explain each package.</w:t>
-      </w:r>
-    </w:p>
-    <w:p>
-      <w:pPr>
-        <w:pStyle w:val="ListBullet"/>
-      </w:pPr>
-      <w:r>
-        <w:t>Separate runtime dependencies from developer/testing dependencies where possible.</w:t>
-      </w:r>
-    </w:p>
-    <w:p>
-      <w:pPr>
-        <w:pStyle w:val="ListBullet"/>
-      </w:pPr>
-      <w:r>
-        <w:t>Document any new dependency in the project log.</w:t>
-      </w:r>
-    </w:p>
-    <w:p>
-      <w:pPr>
-        <w:pStyle w:val="Heading1"/>
-      </w:pPr>
-      <w:r>
-        <w:t>9. Configuration Strategy</w:t>
-      </w:r>
-    </w:p>
-    <w:p>
-      <w:pPr>
-        <w:pStyle w:val="ListBullet"/>
-      </w:pPr>
-      <w:r>
-        <w:t>Use environment variables for values that change by machine or environment.</w:t>
-      </w:r>
-    </w:p>
-    <w:p>
-      <w:pPr>
-        <w:pStyle w:val="ListBullet"/>
-      </w:pPr>
-      <w:r>
-        <w:t>Keep sensitive values out of Git.</w:t>
-      </w:r>
-    </w:p>
-    <w:p>
-      <w:pPr>
-        <w:pStyle w:val="ListBullet"/>
-      </w:pPr>
-      <w:r>
-        <w:t>Store examples in documentation or template files instead of real secrets.</w:t>
-      </w:r>
-    </w:p>
-    <w:p>
-      <w:pPr>
-        <w:pStyle w:val="ListBullet"/>
-      </w:pPr>
-      <w:r>
-        <w:t>Validate configuration early during startup.</w:t>
-      </w:r>
-    </w:p>
-    <w:p>
-      <w:pPr>
-        <w:pStyle w:val="Heading1"/>
-      </w:pPr>
-      <w:r>
-        <w:t>10. Verification Checklist</w:t>
-      </w:r>
-    </w:p>
-    <w:p>
-      <w:r>
-        <w:t>Phase 2 should not be considered complete until the project starts cleanly, the main entry point runs, the test framework is in place, and the repository reflects the new structure without unexpected files.</w:t>
-      </w:r>
-    </w:p>
-    <w:p>
-      <w:pPr>
-        <w:pStyle w:val="ListBullet"/>
-      </w:pPr>
-      <w:r>
-        <w:t>Virtual environment activates correctly.</w:t>
-      </w:r>
-    </w:p>
-    <w:p>
-      <w:pPr>
-        <w:pStyle w:val="ListBullet"/>
-      </w:pPr>
-      <w:r>
-        <w:t>Project root opens correctly in VS Code.</w:t>
-      </w:r>
-    </w:p>
-    <w:p>
-      <w:pPr>
-        <w:pStyle w:val="ListBullet"/>
-      </w:pPr>
-      <w:r>
-        <w:t>Main application entry point runs from the terminal.</w:t>
-      </w:r>
-    </w:p>
-    <w:p>
-      <w:pPr>
-        <w:pStyle w:val="ListBullet"/>
-      </w:pPr>
-      <w:r>
-        <w:t>At least one test path exists and is ready to expand.</w:t>
-      </w:r>
-    </w:p>
-    <w:p>
-      <w:pPr>
-        <w:pStyle w:val="ListBullet"/>
-      </w:pPr>
-      <w:r>
-        <w:t>Configuration strategy is documented.</w:t>
-      </w:r>
-    </w:p>
-    <w:p>
-      <w:pPr>
-        <w:pStyle w:val="ListBullet"/>
-      </w:pPr>
-      <w:r>
-        <w:t>Git status is clean after the phase commit.</w:t>
-      </w:r>
-    </w:p>
-    <w:p>
-      <w:pPr>
-        <w:pStyle w:val="Heading1"/>
-      </w:pPr>
-      <w:r>
-        <w:t>11. Risks and Mitigations</w:t>
+        <w:t>3. Component Responsibilities</w:t>
       </w:r>
     </w:p>
     <w:tbl>
       <w:tblPr>
         <w:tblStyle w:val="TableGrid"/>
         <w:tblW w:type="auto" w:w="0"/>
+        <w:jc w:val="center"/>
         <w:tblLook w:firstColumn="1" w:firstRow="1" w:lastColumn="0" w:lastRow="0" w:noHBand="0" w:noVBand="1" w:val="04A0"/>
       </w:tblPr>
       <w:tblGrid>
-        <w:gridCol w:w="4824"/>
-        <w:gridCol w:w="4824"/>
+        <w:gridCol w:w="4968"/>
+        <w:gridCol w:w="4968"/>
       </w:tblGrid>
       <w:tr>
         <w:tc>
           <w:tcPr>
-            <w:tcW w:type="dxa" w:w="4824"/>
+            <w:tcW w:type="dxa" w:w="4968"/>
           </w:tcPr>
           <w:p>
             <w:r>
-              <w:t>Risk</w:t>
+              <w:rPr>
+                <w:b/>
+              </w:rPr>
+              <w:t>Component</w:t>
             </w:r>
           </w:p>
         </w:tc>
         <w:tc>
           <w:tcPr>
-            <w:tcW w:type="dxa" w:w="4824"/>
+            <w:tcW w:type="dxa" w:w="4968"/>
           </w:tcPr>
           <w:p>
             <w:r>
-              <w:t>Mitigation</w:t>
+              <w:rPr>
+                <w:b/>
+              </w:rPr>
+              <w:t>Responsibility</w:t>
             </w:r>
           </w:p>
         </w:tc>
@@ -793,21 +658,21 @@
       <w:tr>
         <w:tc>
           <w:tcPr>
-            <w:tcW w:type="dxa" w:w="4824"/>
+            <w:tcW w:type="dxa" w:w="4968"/>
           </w:tcPr>
           <w:p>
             <w:r>
-              <w:t>Folder sprawl</w:t>
+              <w:t>app/main.py</w:t>
             </w:r>
           </w:p>
         </w:tc>
         <w:tc>
           <w:tcPr>
-            <w:tcW w:type="dxa" w:w="4824"/>
+            <w:tcW w:type="dxa" w:w="4968"/>
           </w:tcPr>
           <w:p>
             <w:r>
-              <w:t>Keep the structure simple and only create folders that have a clear purpose.</w:t>
+              <w:t>Thin application entry point; initializes logging, loads configuration, invokes the system service, and presents the system summary.</w:t>
             </w:r>
           </w:p>
         </w:tc>
@@ -815,21 +680,21 @@
       <w:tr>
         <w:tc>
           <w:tcPr>
-            <w:tcW w:type="dxa" w:w="4824"/>
+            <w:tcW w:type="dxa" w:w="4968"/>
           </w:tcPr>
           <w:p>
             <w:r>
-              <w:t>Configuration confusion</w:t>
+              <w:t>app/core/config.py</w:t>
             </w:r>
           </w:p>
         </w:tc>
         <w:tc>
           <w:tcPr>
-            <w:tcW w:type="dxa" w:w="4824"/>
+            <w:tcW w:type="dxa" w:w="4968"/>
           </w:tcPr>
           <w:p>
             <w:r>
-              <w:t>Document the difference between defaults, environment values, and secrets.</w:t>
+              <w:t>Central configuration model and environment-variable parsing.</w:t>
             </w:r>
           </w:p>
         </w:tc>
@@ -837,21 +702,21 @@
       <w:tr>
         <w:tc>
           <w:tcPr>
-            <w:tcW w:type="dxa" w:w="4824"/>
+            <w:tcW w:type="dxa" w:w="4968"/>
           </w:tcPr>
           <w:p>
             <w:r>
-              <w:t>Dependency creep</w:t>
+              <w:t>app/core/logging_setup.py</w:t>
             </w:r>
           </w:p>
         </w:tc>
         <w:tc>
           <w:tcPr>
-            <w:tcW w:type="dxa" w:w="4824"/>
+            <w:tcW w:type="dxa" w:w="4968"/>
           </w:tcPr>
           <w:p>
             <w:r>
-              <w:t>Add packages only when there is a direct technical reason.</w:t>
+              <w:t>Application logging initialization.</w:t>
             </w:r>
           </w:p>
         </w:tc>
@@ -859,21 +724,21 @@
       <w:tr>
         <w:tc>
           <w:tcPr>
-            <w:tcW w:type="dxa" w:w="4824"/>
+            <w:tcW w:type="dxa" w:w="4968"/>
           </w:tcPr>
           <w:p>
             <w:r>
-              <w:t>Unclear entry points</w:t>
+              <w:t>app/core/paths.py</w:t>
             </w:r>
           </w:p>
         </w:tc>
         <w:tc>
           <w:tcPr>
-            <w:tcW w:type="dxa" w:w="4824"/>
+            <w:tcW w:type="dxa" w:w="4968"/>
           </w:tcPr>
           <w:p>
             <w:r>
-              <w:t>Define one obvious application start file and one obvious test path.</w:t>
+              <w:t>Reusable project-root path resolution.</w:t>
             </w:r>
           </w:p>
         </w:tc>
@@ -881,21 +746,131 @@
       <w:tr>
         <w:tc>
           <w:tcPr>
-            <w:tcW w:type="dxa" w:w="4824"/>
+            <w:tcW w:type="dxa" w:w="4968"/>
           </w:tcPr>
           <w:p>
             <w:r>
-              <w:t>Broken reproducibility</w:t>
+              <w:t>app/core/project_info.py</w:t>
             </w:r>
           </w:p>
         </w:tc>
         <w:tc>
           <w:tcPr>
-            <w:tcW w:type="dxa" w:w="4824"/>
+            <w:tcW w:type="dxa" w:w="4968"/>
           </w:tcPr>
           <w:p>
             <w:r>
-              <w:t>Verify that the project still runs after each structural change.</w:t>
+              <w:t>Static project metadata including name, version, and phase.</w:t>
+            </w:r>
+          </w:p>
+        </w:tc>
+      </w:tr>
+      <w:tr>
+        <w:tc>
+          <w:tcPr>
+            <w:tcW w:type="dxa" w:w="4968"/>
+          </w:tcPr>
+          <w:p>
+            <w:r>
+              <w:t>app/core/service_result.py</w:t>
+            </w:r>
+          </w:p>
+        </w:tc>
+        <w:tc>
+          <w:tcPr>
+            <w:tcW w:type="dxa" w:w="4968"/>
+          </w:tcPr>
+          <w:p>
+            <w:r>
+              <w:t>Standardized immutable service-operation result contract.</w:t>
+            </w:r>
+          </w:p>
+        </w:tc>
+      </w:tr>
+      <w:tr>
+        <w:tc>
+          <w:tcPr>
+            <w:tcW w:type="dxa" w:w="4968"/>
+          </w:tcPr>
+          <w:p>
+            <w:r>
+              <w:t>app/services/system_service.py</w:t>
+            </w:r>
+          </w:p>
+        </w:tc>
+        <w:tc>
+          <w:tcPr>
+            <w:tcW w:type="dxa" w:w="4968"/>
+          </w:tcPr>
+          <w:p>
+            <w:r>
+              <w:t>Aggregates application/system metadata into a service-level summary.</w:t>
+            </w:r>
+          </w:p>
+        </w:tc>
+      </w:tr>
+      <w:tr>
+        <w:tc>
+          <w:tcPr>
+            <w:tcW w:type="dxa" w:w="4968"/>
+          </w:tcPr>
+          <w:p>
+            <w:r>
+              <w:t>app/models/</w:t>
+            </w:r>
+          </w:p>
+        </w:tc>
+        <w:tc>
+          <w:tcPr>
+            <w:tcW w:type="dxa" w:w="4968"/>
+          </w:tcPr>
+          <w:p>
+            <w:r>
+              <w:t>Reserved for future domain/data models.</w:t>
+            </w:r>
+          </w:p>
+        </w:tc>
+      </w:tr>
+      <w:tr>
+        <w:tc>
+          <w:tcPr>
+            <w:tcW w:type="dxa" w:w="4968"/>
+          </w:tcPr>
+          <w:p>
+            <w:r>
+              <w:t>app/utils/</w:t>
+            </w:r>
+          </w:p>
+        </w:tc>
+        <w:tc>
+          <w:tcPr>
+            <w:tcW w:type="dxa" w:w="4968"/>
+          </w:tcPr>
+          <w:p>
+            <w:r>
+              <w:t>Reserved for reusable utility functions.</w:t>
+            </w:r>
+          </w:p>
+        </w:tc>
+      </w:tr>
+      <w:tr>
+        <w:tc>
+          <w:tcPr>
+            <w:tcW w:type="dxa" w:w="4968"/>
+          </w:tcPr>
+          <w:p>
+            <w:r>
+              <w:t>tests/</w:t>
+            </w:r>
+          </w:p>
+        </w:tc>
+        <w:tc>
+          <w:tcPr>
+            <w:tcW w:type="dxa" w:w="4968"/>
+          </w:tcPr>
+          <w:p>
+            <w:r>
+              <w:t>Automated verification of configuration, services, result contracts, and smoke behaviour.</w:t>
             </w:r>
           </w:p>
         </w:tc>
@@ -906,12 +881,272 @@
         <w:pStyle w:val="Heading1"/>
       </w:pPr>
       <w:r>
-        <w:t>12. Phase 2 Logging Format</w:t>
+        <w:t>4. Project Metadata and Versioning</w:t>
       </w:r>
     </w:p>
     <w:p>
       <w:r>
-        <w:t>Every meaningful implementation step in Phase 2 should be logged using the same pattern so that the project record remains readable months later.</w:t>
+        <w:t>Static project metadata was centralized to avoid scattering version and phase information throughout the application.</w:t>
+      </w:r>
+    </w:p>
+    <w:p>
+      <w:pPr>
+        <w:ind w:left="360"/>
+      </w:pPr>
+      <w:r>
+        <w:rPr>
+          <w:rFonts w:ascii="Consolas" w:hAnsi="Consolas"/>
+          <w:sz w:val="18"/>
+        </w:rPr>
+        <w:t>PROJECT_NAME = "NOVYRA OS"</w:t>
+        <w:br/>
+        <w:t>PROJECT_VERSION = "0.2.0"</w:t>
+        <w:br/>
+        <w:t>PROJECT_STAGE = "Phase 2 - Core Application Skeleton"</w:t>
+      </w:r>
+    </w:p>
+    <w:p>
+      <w:r>
+        <w:t>The runtime output confirms the version and phase information are integrated into the application presentation.</w:t>
+      </w:r>
+    </w:p>
+    <w:p>
+      <w:pPr>
+        <w:pStyle w:val="Heading1"/>
+      </w:pPr>
+      <w:r>
+        <w:t>5. Project Path Management</w:t>
+      </w:r>
+    </w:p>
+    <w:p>
+      <w:r>
+        <w:t>The paths module provides a reusable method for resolving the project root, avoiding hard-coded absolute paths throughout the application and creating a foundation for future resources and storage.</w:t>
+      </w:r>
+    </w:p>
+    <w:p>
+      <w:pPr>
+        <w:ind w:left="360"/>
+      </w:pPr>
+      <w:r>
+        <w:rPr>
+          <w:rFonts w:ascii="Consolas" w:hAnsi="Consolas"/>
+          <w:sz w:val="18"/>
+        </w:rPr>
+        <w:t>def get_project_root() -&gt; Path:</w:t>
+        <w:br/>
+        <w:t xml:space="preserve">    return Path(__file__).resolve().parents[3]</w:t>
+      </w:r>
+    </w:p>
+    <w:p>
+      <w:pPr>
+        <w:pStyle w:val="Heading1"/>
+      </w:pPr>
+      <w:r>
+        <w:t>6. Environment Configuration</w:t>
+      </w:r>
+    </w:p>
+    <w:p>
+      <w:r>
+        <w:t>Configuration uses environment variables with safe development defaults. The configuration object is immutable and exposes the runtime values required by the application.</w:t>
+      </w:r>
+    </w:p>
+    <w:tbl>
+      <w:tblPr>
+        <w:tblStyle w:val="TableGrid"/>
+        <w:tblW w:type="auto" w:w="0"/>
+        <w:jc w:val="center"/>
+        <w:tblLook w:firstColumn="1" w:firstRow="1" w:lastColumn="0" w:lastRow="0" w:noHBand="0" w:noVBand="1" w:val="04A0"/>
+      </w:tblPr>
+      <w:tblGrid>
+        <w:gridCol w:w="2484"/>
+        <w:gridCol w:w="2484"/>
+        <w:gridCol w:w="2484"/>
+        <w:gridCol w:w="2484"/>
+      </w:tblGrid>
+      <w:tr>
+        <w:tc>
+          <w:tcPr>
+            <w:tcW w:type="dxa" w:w="2484"/>
+          </w:tcPr>
+          <w:p>
+            <w:r>
+              <w:rPr>
+                <w:b/>
+              </w:rPr>
+              <w:t>Variable</w:t>
+            </w:r>
+          </w:p>
+        </w:tc>
+        <w:tc>
+          <w:tcPr>
+            <w:tcW w:type="dxa" w:w="2484"/>
+          </w:tcPr>
+          <w:p>
+            <w:r>
+              <w:rPr>
+                <w:b/>
+              </w:rPr>
+              <w:t>Purpose</w:t>
+            </w:r>
+          </w:p>
+        </w:tc>
+        <w:tc>
+          <w:tcPr>
+            <w:tcW w:type="dxa" w:w="2484"/>
+          </w:tcPr>
+          <w:p>
+            <w:r>
+              <w:rPr>
+                <w:b/>
+              </w:rPr>
+              <w:t>Development</w:t>
+            </w:r>
+          </w:p>
+        </w:tc>
+        <w:tc>
+          <w:tcPr>
+            <w:tcW w:type="dxa" w:w="2484"/>
+          </w:tcPr>
+          <w:p>
+            <w:r>
+              <w:rPr>
+                <w:b/>
+              </w:rPr>
+              <w:t>Production</w:t>
+            </w:r>
+          </w:p>
+        </w:tc>
+      </w:tr>
+      <w:tr>
+        <w:tc>
+          <w:tcPr>
+            <w:tcW w:type="dxa" w:w="2484"/>
+          </w:tcPr>
+          <w:p>
+            <w:r>
+              <w:t>NOVYRA_PROJECT_NAME</w:t>
+            </w:r>
+          </w:p>
+        </w:tc>
+        <w:tc>
+          <w:tcPr>
+            <w:tcW w:type="dxa" w:w="2484"/>
+          </w:tcPr>
+          <w:p>
+            <w:r>
+              <w:t>Application/project name</w:t>
+            </w:r>
+          </w:p>
+        </w:tc>
+        <w:tc>
+          <w:tcPr>
+            <w:tcW w:type="dxa" w:w="2484"/>
+          </w:tcPr>
+          <w:p>
+            <w:r>
+              <w:t>NOVYRA OS</w:t>
+            </w:r>
+          </w:p>
+        </w:tc>
+        <w:tc>
+          <w:tcPr>
+            <w:tcW w:type="dxa" w:w="2484"/>
+          </w:tcPr>
+          <w:p>
+            <w:r>
+              <w:t>NOVYRA OS</w:t>
+            </w:r>
+          </w:p>
+        </w:tc>
+      </w:tr>
+      <w:tr>
+        <w:tc>
+          <w:tcPr>
+            <w:tcW w:type="dxa" w:w="2484"/>
+          </w:tcPr>
+          <w:p>
+            <w:r>
+              <w:t>NOVYRA_ENVIRONMENT</w:t>
+            </w:r>
+          </w:p>
+        </w:tc>
+        <w:tc>
+          <w:tcPr>
+            <w:tcW w:type="dxa" w:w="2484"/>
+          </w:tcPr>
+          <w:p>
+            <w:r>
+              <w:t>Runtime environment</w:t>
+            </w:r>
+          </w:p>
+        </w:tc>
+        <w:tc>
+          <w:tcPr>
+            <w:tcW w:type="dxa" w:w="2484"/>
+          </w:tcPr>
+          <w:p>
+            <w:r>
+              <w:t>development</w:t>
+            </w:r>
+          </w:p>
+        </w:tc>
+        <w:tc>
+          <w:tcPr>
+            <w:tcW w:type="dxa" w:w="2484"/>
+          </w:tcPr>
+          <w:p>
+            <w:r>
+              <w:t>production</w:t>
+            </w:r>
+          </w:p>
+        </w:tc>
+      </w:tr>
+      <w:tr>
+        <w:tc>
+          <w:tcPr>
+            <w:tcW w:type="dxa" w:w="2484"/>
+          </w:tcPr>
+          <w:p>
+            <w:r>
+              <w:t>NOVYRA_DEBUG</w:t>
+            </w:r>
+          </w:p>
+        </w:tc>
+        <w:tc>
+          <w:tcPr>
+            <w:tcW w:type="dxa" w:w="2484"/>
+          </w:tcPr>
+          <w:p>
+            <w:r>
+              <w:t>Controls debug mode</w:t>
+            </w:r>
+          </w:p>
+        </w:tc>
+        <w:tc>
+          <w:tcPr>
+            <w:tcW w:type="dxa" w:w="2484"/>
+          </w:tcPr>
+          <w:p>
+            <w:r>
+              <w:t>true</w:t>
+            </w:r>
+          </w:p>
+        </w:tc>
+        <w:tc>
+          <w:tcPr>
+            <w:tcW w:type="dxa" w:w="2484"/>
+          </w:tcPr>
+          <w:p>
+            <w:r>
+              <w:t>false</w:t>
+            </w:r>
+          </w:p>
+        </w:tc>
+      </w:tr>
+    </w:tbl>
+    <w:p>
+      <w:r>
+        <w:t>Accepted boolean values:</w:t>
       </w:r>
     </w:p>
     <w:p>
@@ -919,7 +1154,7 @@
         <w:pStyle w:val="ListBullet"/>
       </w:pPr>
       <w:r>
-        <w:t>Date and time.</w:t>
+        <w:t>True: 1, true, yes, on</w:t>
       </w:r>
     </w:p>
     <w:p>
@@ -927,7 +1162,20 @@
         <w:pStyle w:val="ListBullet"/>
       </w:pPr>
       <w:r>
-        <w:t>Action taken.</w:t>
+        <w:t>False: 0, false, no, off</w:t>
+      </w:r>
+    </w:p>
+    <w:p>
+      <w:r>
+        <w:t>Invalid boolean values raise ValueError rather than silently defaulting. This fail-fast behaviour reduces configuration ambiguity.</w:t>
+      </w:r>
+    </w:p>
+    <w:p>
+      <w:pPr>
+        <w:pStyle w:val="Heading1"/>
+      </w:pPr>
+      <w:r>
+        <w:t>7. Environment Templates and Security</w:t>
       </w:r>
     </w:p>
     <w:p>
@@ -935,7 +1183,7 @@
         <w:pStyle w:val="ListBullet"/>
       </w:pPr>
       <w:r>
-        <w:t>Reason for the action.</w:t>
+        <w:t>The root .env.example provides local development configuration guidance.</w:t>
       </w:r>
     </w:p>
     <w:p>
@@ -943,7 +1191,7 @@
         <w:pStyle w:val="ListBullet"/>
       </w:pPr>
       <w:r>
-        <w:t>Result observed.</w:t>
+        <w:t>development.env.example provides a development template.</w:t>
       </w:r>
     </w:p>
     <w:p>
@@ -951,7 +1199,7 @@
         <w:pStyle w:val="ListBullet"/>
       </w:pPr>
       <w:r>
-        <w:t>Any issue encountered.</w:t>
+        <w:t>production.env.example provides a production template with debug disabled.</w:t>
       </w:r>
     </w:p>
     <w:p>
@@ -959,7 +1207,23 @@
         <w:pStyle w:val="ListBullet"/>
       </w:pPr>
       <w:r>
-        <w:t>Decision or follow-up.</w:t>
+        <w:t>Templates contain examples only and must not contain real secrets.</w:t>
+      </w:r>
+    </w:p>
+    <w:p>
+      <w:pPr>
+        <w:pStyle w:val="ListBullet"/>
+      </w:pPr>
+      <w:r>
+        <w:t>Production credentials must be supplied securely by the deployment environment.</w:t>
+      </w:r>
+    </w:p>
+    <w:p>
+      <w:pPr>
+        <w:pStyle w:val="ListBullet"/>
+      </w:pPr>
+      <w:r>
+        <w:t>The project does not yet implement dedicated secret management; this is deferred until required by later integrations.</w:t>
       </w:r>
     </w:p>
     <w:p>
@@ -967,7 +1231,86 @@
         <w:pStyle w:val="Heading1"/>
       </w:pPr>
       <w:r>
-        <w:t>13. Phase 2 Completion Criteria</w:t>
+        <w:t>8. Service Layer</w:t>
+      </w:r>
+    </w:p>
+    <w:p>
+      <w:r>
+        <w:t>The system service introduced a dedicated service layer between the application entry point and core configuration/metadata.</w:t>
+      </w:r>
+    </w:p>
+    <w:p>
+      <w:pPr>
+        <w:ind w:left="360"/>
+      </w:pPr>
+      <w:r>
+        <w:rPr>
+          <w:rFonts w:ascii="Consolas" w:hAnsi="Consolas"/>
+          <w:sz w:val="18"/>
+        </w:rPr>
+        <w:t>Application Entry Point</w:t>
+        <w:br/>
+        <w:t xml:space="preserve">        │</w:t>
+        <w:br/>
+        <w:t xml:space="preserve">        ▼</w:t>
+        <w:br/>
+        <w:t xml:space="preserve">     main.py</w:t>
+        <w:br/>
+        <w:t xml:space="preserve">        │</w:t>
+        <w:br/>
+        <w:t xml:space="preserve">        ▼</w:t>
+        <w:br/>
+        <w:t xml:space="preserve"> system_service.py</w:t>
+        <w:br/>
+        <w:t xml:space="preserve">        │</w:t>
+        <w:br/>
+        <w:t xml:space="preserve">        ▼</w:t>
+        <w:br/>
+        <w:t>Core Configuration + Metadata + Project Paths</w:t>
+        <w:br/>
+        <w:t xml:space="preserve">        │</w:t>
+        <w:br/>
+        <w:t xml:space="preserve">        ▼</w:t>
+        <w:br/>
+        <w:t xml:space="preserve">    System Summary</w:t>
+      </w:r>
+    </w:p>
+    <w:p>
+      <w:r>
+        <w:t>The service currently produces project name, version, phase/stage, environment, debug status, and project root. This establishes a pattern for future services to encapsulate application operations instead of placing business logic in main.py.</w:t>
+      </w:r>
+    </w:p>
+    <w:p>
+      <w:pPr>
+        <w:pStyle w:val="Heading1"/>
+      </w:pPr>
+      <w:r>
+        <w:t>9. ServiceResult Architecture</w:t>
+      </w:r>
+    </w:p>
+    <w:p>
+      <w:r>
+        <w:t>A standardized ServiceResult abstraction was introduced to provide a consistent contract for future service operations.</w:t>
+      </w:r>
+    </w:p>
+    <w:p>
+      <w:pPr>
+        <w:ind w:left="360"/>
+      </w:pPr>
+      <w:r>
+        <w:rPr>
+          <w:rFonts w:ascii="Consolas" w:hAnsi="Consolas"/>
+          <w:sz w:val="18"/>
+        </w:rPr>
+        <w:t>ServiceResult[T]</w:t>
+        <w:br/>
+        <w:t>├── success</w:t>
+        <w:br/>
+        <w:t>├── data</w:t>
+        <w:br/>
+        <w:t>├── message</w:t>
+        <w:br/>
+        <w:t>└── error_code</w:t>
       </w:r>
     </w:p>
     <w:p>
@@ -975,7 +1318,7 @@
         <w:pStyle w:val="ListBullet"/>
       </w:pPr>
       <w:r>
-        <w:t>The core application skeleton exists and runs.</w:t>
+        <w:t>Generic typing through ServiceResult[T].</w:t>
       </w:r>
     </w:p>
     <w:p>
@@ -983,7 +1326,7 @@
         <w:pStyle w:val="ListBullet"/>
       </w:pPr>
       <w:r>
-        <w:t>The dependency strategy is clear.</w:t>
+        <w:t>Success factory for successful operations.</w:t>
       </w:r>
     </w:p>
     <w:p>
@@ -991,7 +1334,7 @@
         <w:pStyle w:val="ListBullet"/>
       </w:pPr>
       <w:r>
-        <w:t>The code structure is maintainable.</w:t>
+        <w:t>Failure factory for failed operations.</w:t>
       </w:r>
     </w:p>
     <w:p>
@@ -999,7 +1342,7 @@
         <w:pStyle w:val="ListBullet"/>
       </w:pPr>
       <w:r>
-        <w:t>The configuration approach is documented.</w:t>
+        <w:t>Optional result data.</w:t>
       </w:r>
     </w:p>
     <w:p>
@@ -1007,7 +1350,7 @@
         <w:pStyle w:val="ListBullet"/>
       </w:pPr>
       <w:r>
-        <w:t>The initial tests are in place.</w:t>
+        <w:t>Human-readable messages.</w:t>
       </w:r>
     </w:p>
     <w:p>
@@ -1015,7 +1358,7 @@
         <w:pStyle w:val="ListBullet"/>
       </w:pPr>
       <w:r>
-        <w:t>The project log records the outcome.</w:t>
+        <w:t>Optional machine-readable error codes.</w:t>
       </w:r>
     </w:p>
     <w:p>
@@ -1023,7 +1366,12 @@
         <w:pStyle w:val="ListBullet"/>
       </w:pPr>
       <w:r>
-        <w:t>The phase baseline is committed to Git.</w:t>
+        <w:t>Immutability through a frozen dataclass.</w:t>
+      </w:r>
+    </w:p>
+    <w:p>
+      <w:r>
+        <w:t>This contract is intended to become a common integration boundary for future services, API handlers, orchestration logic, and background jobs.</w:t>
       </w:r>
     </w:p>
     <w:p>
@@ -1031,63 +1379,12 @@
         <w:pStyle w:val="Heading1"/>
       </w:pPr>
       <w:r>
-        <w:t>14. Proposed Next Steps After This Document</w:t>
+        <w:t>10. Application Entry Point Integration</w:t>
       </w:r>
     </w:p>
     <w:p>
-      <w:pPr>
-        <w:pStyle w:val="ListNumber"/>
-      </w:pPr>
       <w:r>
-        <w:t>Review this document and confirm the scope.</w:t>
-      </w:r>
-    </w:p>
-    <w:p>
-      <w:pPr>
-        <w:pStyle w:val="ListNumber"/>
-      </w:pPr>
-      <w:r>
-        <w:t>Start the Phase 2 build with the source code skeleton.</w:t>
-      </w:r>
-    </w:p>
-    <w:p>
-      <w:pPr>
-        <w:pStyle w:val="ListNumber"/>
-      </w:pPr>
-      <w:r>
-        <w:t>Add the first reusable module for configuration or logging.</w:t>
-      </w:r>
-    </w:p>
-    <w:p>
-      <w:pPr>
-        <w:pStyle w:val="ListNumber"/>
-      </w:pPr>
-      <w:r>
-        <w:t>Create the initial test path.</w:t>
-      </w:r>
-    </w:p>
-    <w:p>
-      <w:pPr>
-        <w:pStyle w:val="ListNumber"/>
-      </w:pPr>
-      <w:r>
-        <w:t>Run the application and verify it from VS Code and the terminal.</w:t>
-      </w:r>
-    </w:p>
-    <w:p>
-      <w:pPr>
-        <w:pStyle w:val="ListNumber"/>
-      </w:pPr>
-      <w:r>
-        <w:t>Record everything in the project log.</w:t>
-      </w:r>
-    </w:p>
-    <w:p>
-      <w:pPr>
-        <w:pStyle w:val="ListNumber"/>
-      </w:pPr>
-      <w:r>
-        <w:t>Commit the Phase 2 baseline to Git.</w:t>
+        <w:t>main.py was refactored to remain thin. It initializes logging, loads configuration, requests the system summary from the service layer, and presents the result. Configuration parsing, path resolution, and service logic remain outside the entry point.</w:t>
       </w:r>
     </w:p>
     <w:p>
@@ -1095,30 +1392,1715 @@
         <w:pStyle w:val="Heading1"/>
       </w:pPr>
       <w:r>
-        <w:t>15. Summary</w:t>
+        <w:t>11. Automated Testing</w:t>
       </w:r>
     </w:p>
     <w:p>
       <w:r>
-        <w:t>Phase 2 is the point where NOVYRA OS stops being only a documented idea and starts becoming a disciplined software codebase. The focus is not size; the focus is control, clarity, and reproducibility. If this phase is executed properly, every later phase becomes much easier to build, test, and maintain.</w:t>
+        <w:t>pytest was installed as the development test framework. The test suite validates configuration defaults, production configuration, boolean parsing, invalid values, service behaviour, project-root reporting, ServiceResult behaviour, immutability, and smoke behaviour.</w:t>
+      </w:r>
+    </w:p>
+    <w:tbl>
+      <w:tblPr>
+        <w:tblStyle w:val="TableGrid"/>
+        <w:tblW w:type="auto" w:w="0"/>
+        <w:jc w:val="center"/>
+        <w:tblLook w:firstColumn="1" w:firstRow="1" w:lastColumn="0" w:lastRow="0" w:noHBand="0" w:noVBand="1" w:val="04A0"/>
+      </w:tblPr>
+      <w:tblGrid>
+        <w:gridCol w:w="4968"/>
+        <w:gridCol w:w="4968"/>
+      </w:tblGrid>
+      <w:tr>
+        <w:tc>
+          <w:tcPr>
+            <w:tcW w:type="dxa" w:w="4968"/>
+          </w:tcPr>
+          <w:p>
+            <w:r>
+              <w:rPr>
+                <w:b/>
+              </w:rPr>
+              <w:t>Test Area</w:t>
+            </w:r>
+          </w:p>
+        </w:tc>
+        <w:tc>
+          <w:tcPr>
+            <w:tcW w:type="dxa" w:w="4968"/>
+          </w:tcPr>
+          <w:p>
+            <w:r>
+              <w:rPr>
+                <w:b/>
+              </w:rPr>
+              <w:t>Coverage</w:t>
+            </w:r>
+          </w:p>
+        </w:tc>
+      </w:tr>
+      <w:tr>
+        <w:tc>
+          <w:tcPr>
+            <w:tcW w:type="dxa" w:w="4968"/>
+          </w:tcPr>
+          <w:p>
+            <w:r>
+              <w:t>Configuration</w:t>
+            </w:r>
+          </w:p>
+        </w:tc>
+        <w:tc>
+          <w:tcPr>
+            <w:tcW w:type="dxa" w:w="4968"/>
+          </w:tcPr>
+          <w:p>
+            <w:r>
+              <w:t>Defaults, production values, accepted true/false values, invalid boolean handling.</w:t>
+            </w:r>
+          </w:p>
+        </w:tc>
+      </w:tr>
+      <w:tr>
+        <w:tc>
+          <w:tcPr>
+            <w:tcW w:type="dxa" w:w="4968"/>
+          </w:tcPr>
+          <w:p>
+            <w:r>
+              <w:t>ServiceResult</w:t>
+            </w:r>
+          </w:p>
+        </w:tc>
+        <w:tc>
+          <w:tcPr>
+            <w:tcW w:type="dxa" w:w="4968"/>
+          </w:tcPr>
+          <w:p>
+            <w:r>
+              <w:t>Success, failure, optional data, optional error code, immutability.</w:t>
+            </w:r>
+          </w:p>
+        </w:tc>
+      </w:tr>
+      <w:tr>
+        <w:tc>
+          <w:tcPr>
+            <w:tcW w:type="dxa" w:w="4968"/>
+          </w:tcPr>
+          <w:p>
+            <w:r>
+              <w:t>System Service</w:t>
+            </w:r>
+          </w:p>
+        </w:tc>
+        <w:tc>
+          <w:tcPr>
+            <w:tcW w:type="dxa" w:w="4968"/>
+          </w:tcPr>
+          <w:p>
+            <w:r>
+              <w:t>System summary generation and project-root inclusion.</w:t>
+            </w:r>
+          </w:p>
+        </w:tc>
+      </w:tr>
+      <w:tr>
+        <w:tc>
+          <w:tcPr>
+            <w:tcW w:type="dxa" w:w="4968"/>
+          </w:tcPr>
+          <w:p>
+            <w:r>
+              <w:t>Smoke Test</w:t>
+            </w:r>
+          </w:p>
+        </w:tc>
+        <w:tc>
+          <w:tcPr>
+            <w:tcW w:type="dxa" w:w="4968"/>
+          </w:tcPr>
+          <w:p>
+            <w:r>
+              <w:t>Basic application-level test coverage.</w:t>
+            </w:r>
+          </w:p>
+        </w:tc>
+      </w:tr>
+    </w:tbl>
+    <w:p>
+      <w:pPr>
+        <w:pStyle w:val="Heading1"/>
+      </w:pPr>
+      <w:r>
+        <w:t>12. Verification Results</w:t>
+      </w:r>
+    </w:p>
+    <w:tbl>
+      <w:tblPr>
+        <w:tblStyle w:val="TableGrid"/>
+        <w:tblW w:type="auto" w:w="0"/>
+        <w:jc w:val="center"/>
+        <w:tblLook w:firstColumn="1" w:firstRow="1" w:lastColumn="0" w:lastRow="0" w:noHBand="0" w:noVBand="1" w:val="04A0"/>
+      </w:tblPr>
+      <w:tblGrid>
+        <w:gridCol w:w="4968"/>
+        <w:gridCol w:w="4968"/>
+      </w:tblGrid>
+      <w:tr>
+        <w:tc>
+          <w:tcPr>
+            <w:tcW w:type="dxa" w:w="4968"/>
+          </w:tcPr>
+          <w:p>
+            <w:r>
+              <w:rPr>
+                <w:b/>
+              </w:rPr>
+              <w:t>Verification</w:t>
+            </w:r>
+          </w:p>
+        </w:tc>
+        <w:tc>
+          <w:tcPr>
+            <w:tcW w:type="dxa" w:w="4968"/>
+          </w:tcPr>
+          <w:p>
+            <w:r>
+              <w:rPr>
+                <w:b/>
+              </w:rPr>
+              <w:t>Result</w:t>
+            </w:r>
+          </w:p>
+        </w:tc>
+      </w:tr>
+      <w:tr>
+        <w:tc>
+          <w:tcPr>
+            <w:tcW w:type="dxa" w:w="4968"/>
+          </w:tcPr>
+          <w:p>
+            <w:r>
+              <w:t>pytest test suite</w:t>
+            </w:r>
+          </w:p>
+        </w:tc>
+        <w:tc>
+          <w:tcPr>
+            <w:tcW w:type="dxa" w:w="4968"/>
+          </w:tcPr>
+          <w:p>
+            <w:r>
+              <w:t>23 passed</w:t>
+            </w:r>
+          </w:p>
+        </w:tc>
+      </w:tr>
+      <w:tr>
+        <w:tc>
+          <w:tcPr>
+            <w:tcW w:type="dxa" w:w="4968"/>
+          </w:tcPr>
+          <w:p>
+            <w:r>
+              <w:t>Test execution time</w:t>
+            </w:r>
+          </w:p>
+        </w:tc>
+        <w:tc>
+          <w:tcPr>
+            <w:tcW w:type="dxa" w:w="4968"/>
+          </w:tcPr>
+          <w:p>
+            <w:r>
+              <w:t>Approximately 0.11 seconds</w:t>
+            </w:r>
+          </w:p>
+        </w:tc>
+      </w:tr>
+      <w:tr>
+        <w:tc>
+          <w:tcPr>
+            <w:tcW w:type="dxa" w:w="4968"/>
+          </w:tcPr>
+          <w:p>
+            <w:r>
+              <w:t>Application startup</w:t>
+            </w:r>
+          </w:p>
+        </w:tc>
+        <w:tc>
+          <w:tcPr>
+            <w:tcW w:type="dxa" w:w="4968"/>
+          </w:tcPr>
+          <w:p>
+            <w:r>
+              <w:t>Successful</w:t>
+            </w:r>
+          </w:p>
+        </w:tc>
+      </w:tr>
+      <w:tr>
+        <w:tc>
+          <w:tcPr>
+            <w:tcW w:type="dxa" w:w="4968"/>
+          </w:tcPr>
+          <w:p>
+            <w:r>
+              <w:t>git diff --check</w:t>
+            </w:r>
+          </w:p>
+        </w:tc>
+        <w:tc>
+          <w:tcPr>
+            <w:tcW w:type="dxa" w:w="4968"/>
+          </w:tcPr>
+          <w:p>
+            <w:r>
+              <w:t>Passed</w:t>
+            </w:r>
+          </w:p>
+        </w:tc>
+      </w:tr>
+      <w:tr>
+        <w:tc>
+          <w:tcPr>
+            <w:tcW w:type="dxa" w:w="4968"/>
+          </w:tcPr>
+          <w:p>
+            <w:r>
+              <w:t>Final Git working tree</w:t>
+            </w:r>
+          </w:p>
+        </w:tc>
+        <w:tc>
+          <w:tcPr>
+            <w:tcW w:type="dxa" w:w="4968"/>
+          </w:tcPr>
+          <w:p>
+            <w:r>
+              <w:t>Clean</w:t>
+            </w:r>
+          </w:p>
+        </w:tc>
+      </w:tr>
+      <w:tr>
+        <w:tc>
+          <w:tcPr>
+            <w:tcW w:type="dxa" w:w="4968"/>
+          </w:tcPr>
+          <w:p>
+            <w:r>
+              <w:t>Branch</w:t>
+            </w:r>
+          </w:p>
+        </w:tc>
+        <w:tc>
+          <w:tcPr>
+            <w:tcW w:type="dxa" w:w="4968"/>
+          </w:tcPr>
+          <w:p>
+            <w:r>
+              <w:t>main tracking origin/main</w:t>
+            </w:r>
+          </w:p>
+        </w:tc>
+      </w:tr>
+    </w:tbl>
+    <w:p>
+      <w:pPr>
+        <w:pStyle w:val="Heading1"/>
+      </w:pPr>
+      <w:r>
+        <w:t>13. Runtime Verification Output</w:t>
+      </w:r>
+    </w:p>
+    <w:p>
+      <w:r>
+        <w:t>Verified application startup output:</w:t>
       </w:r>
     </w:p>
     <w:p>
       <w:pPr>
-        <w:jc w:val="center"/>
+        <w:ind w:left="360"/>
       </w:pPr>
       <w:r>
         <w:rPr>
-          <w:i/>
+          <w:rFonts w:ascii="Consolas" w:hAnsi="Consolas"/>
           <w:sz w:val="18"/>
         </w:rPr>
-        <w:t>NOVYRA OS — Phase 2 Master Documentation</w:t>
+        <w:t>==================================================</w:t>
+        <w:br/>
+        <w:t>NOVYRA OS</w:t>
+        <w:br/>
+        <w:t>==================================================</w:t>
+        <w:br/>
+        <w:t>Version: 0.2.0</w:t>
+        <w:br/>
+        <w:t>Stage: Phase 2 - Core Application Skeleton</w:t>
+        <w:br/>
+        <w:t>Environment: development</w:t>
+        <w:br/>
+        <w:t>Debug Mode: True</w:t>
+        <w:br/>
+        <w:t>Project Root: C:\Dev\NOVYRA_OS</w:t>
+        <w:br/>
+        <w:t>==================================================</w:t>
+      </w:r>
+    </w:p>
+    <w:p>
+      <w:pPr>
+        <w:pStyle w:val="Heading1"/>
+      </w:pPr>
+      <w:r>
+        <w:t>14. Git and Version-Control Checkpoints</w:t>
+      </w:r>
+    </w:p>
+    <w:p>
+      <w:r>
+        <w:t>Git is the source-of-truth checkpoint mechanism. The GitHub remote was configured and the main branch established as the active branch.</w:t>
+      </w:r>
+    </w:p>
+    <w:tbl>
+      <w:tblPr>
+        <w:tblStyle w:val="TableGrid"/>
+        <w:tblW w:type="auto" w:w="0"/>
+        <w:jc w:val="center"/>
+        <w:tblLook w:firstColumn="1" w:firstRow="1" w:lastColumn="0" w:lastRow="0" w:noHBand="0" w:noVBand="1" w:val="04A0"/>
+      </w:tblPr>
+      <w:tblGrid>
+        <w:gridCol w:w="3312"/>
+        <w:gridCol w:w="3312"/>
+        <w:gridCol w:w="3312"/>
+      </w:tblGrid>
+      <w:tr>
+        <w:tc>
+          <w:tcPr>
+            <w:tcW w:type="dxa" w:w="3312"/>
+          </w:tcPr>
+          <w:p>
+            <w:r>
+              <w:rPr>
+                <w:b/>
+              </w:rPr>
+              <w:t>Checkpoint</w:t>
+            </w:r>
+          </w:p>
+        </w:tc>
+        <w:tc>
+          <w:tcPr>
+            <w:tcW w:type="dxa" w:w="3312"/>
+          </w:tcPr>
+          <w:p>
+            <w:r>
+              <w:rPr>
+                <w:b/>
+              </w:rPr>
+              <w:t>Commit</w:t>
+            </w:r>
+          </w:p>
+        </w:tc>
+        <w:tc>
+          <w:tcPr>
+            <w:tcW w:type="dxa" w:w="3312"/>
+          </w:tcPr>
+          <w:p>
+            <w:r>
+              <w:rPr>
+                <w:b/>
+              </w:rPr>
+              <w:t>Description</w:t>
+            </w:r>
+          </w:p>
+        </w:tc>
+      </w:tr>
+      <w:tr>
+        <w:tc>
+          <w:tcPr>
+            <w:tcW w:type="dxa" w:w="3312"/>
+          </w:tcPr>
+          <w:p>
+            <w:r>
+              <w:t>Phase 2 skeleton</w:t>
+            </w:r>
+          </w:p>
+        </w:tc>
+        <w:tc>
+          <w:tcPr>
+            <w:tcW w:type="dxa" w:w="3312"/>
+          </w:tcPr>
+          <w:p>
+            <w:r>
+              <w:t>606faf4</w:t>
+            </w:r>
+          </w:p>
+        </w:tc>
+        <w:tc>
+          <w:tcPr>
+            <w:tcW w:type="dxa" w:w="3312"/>
+          </w:tcPr>
+          <w:p>
+            <w:r>
+              <w:t>Core application skeleton and configuration.</w:t>
+            </w:r>
+          </w:p>
+        </w:tc>
+      </w:tr>
+      <w:tr>
+        <w:tc>
+          <w:tcPr>
+            <w:tcW w:type="dxa" w:w="3312"/>
+          </w:tcPr>
+          <w:p>
+            <w:r>
+              <w:t>Project metadata and paths</w:t>
+            </w:r>
+          </w:p>
+        </w:tc>
+        <w:tc>
+          <w:tcPr>
+            <w:tcW w:type="dxa" w:w="3312"/>
+          </w:tcPr>
+          <w:p>
+            <w:r>
+              <w:t>70b6dc2</w:t>
+            </w:r>
+          </w:p>
+        </w:tc>
+        <w:tc>
+          <w:tcPr>
+            <w:tcW w:type="dxa" w:w="3312"/>
+          </w:tcPr>
+          <w:p>
+            <w:r>
+              <w:t>Added project metadata and path configuration.</w:t>
+            </w:r>
+          </w:p>
+        </w:tc>
+      </w:tr>
+      <w:tr>
+        <w:tc>
+          <w:tcPr>
+            <w:tcW w:type="dxa" w:w="3312"/>
+          </w:tcPr>
+          <w:p>
+            <w:r>
+              <w:t>Environment configuration</w:t>
+            </w:r>
+          </w:p>
+        </w:tc>
+        <w:tc>
+          <w:tcPr>
+            <w:tcW w:type="dxa" w:w="3312"/>
+          </w:tcPr>
+          <w:p>
+            <w:r>
+              <w:t>2be865e</w:t>
+            </w:r>
+          </w:p>
+        </w:tc>
+        <w:tc>
+          <w:tcPr>
+            <w:tcW w:type="dxa" w:w="3312"/>
+          </w:tcPr>
+          <w:p>
+            <w:r>
+              <w:t>Implemented environment configuration and tests.</w:t>
+            </w:r>
+          </w:p>
+        </w:tc>
+      </w:tr>
+      <w:tr>
+        <w:tc>
+          <w:tcPr>
+            <w:tcW w:type="dxa" w:w="3312"/>
+          </w:tcPr>
+          <w:p>
+            <w:r>
+              <w:t>System service layer</w:t>
+            </w:r>
+          </w:p>
+        </w:tc>
+        <w:tc>
+          <w:tcPr>
+            <w:tcW w:type="dxa" w:w="3312"/>
+          </w:tcPr>
+          <w:p>
+            <w:r>
+              <w:t>ea2ed41</w:t>
+            </w:r>
+          </w:p>
+        </w:tc>
+        <w:tc>
+          <w:tcPr>
+            <w:tcW w:type="dxa" w:w="3312"/>
+          </w:tcPr>
+          <w:p>
+            <w:r>
+              <w:t>Added system service layer and updated Phase 2 documentation artifact.</w:t>
+            </w:r>
+          </w:p>
+        </w:tc>
+      </w:tr>
+    </w:tbl>
+    <w:p>
+      <w:r>
+        <w:t>The latest recorded checkpoint left the main branch synchronized with origin/main and the working tree clean.</w:t>
+      </w:r>
+    </w:p>
+    <w:p>
+      <w:pPr>
+        <w:pStyle w:val="Heading1"/>
+      </w:pPr>
+      <w:r>
+        <w:t>15. Problems Encountered and Resolutions</w:t>
+      </w:r>
+    </w:p>
+    <w:tbl>
+      <w:tblPr>
+        <w:tblStyle w:val="TableGrid"/>
+        <w:tblW w:type="auto" w:w="0"/>
+        <w:jc w:val="center"/>
+        <w:tblLook w:firstColumn="1" w:firstRow="1" w:lastColumn="0" w:lastRow="0" w:noHBand="0" w:noVBand="1" w:val="04A0"/>
+      </w:tblPr>
+      <w:tblGrid>
+        <w:gridCol w:w="4968"/>
+        <w:gridCol w:w="4968"/>
+      </w:tblGrid>
+      <w:tr>
+        <w:tc>
+          <w:tcPr>
+            <w:tcW w:type="dxa" w:w="4968"/>
+          </w:tcPr>
+          <w:p>
+            <w:r>
+              <w:rPr>
+                <w:b/>
+              </w:rPr>
+              <w:t>Issue</w:t>
+            </w:r>
+          </w:p>
+        </w:tc>
+        <w:tc>
+          <w:tcPr>
+            <w:tcW w:type="dxa" w:w="4968"/>
+          </w:tcPr>
+          <w:p>
+            <w:r>
+              <w:rPr>
+                <w:b/>
+              </w:rPr>
+              <w:t>Resolution</w:t>
+            </w:r>
+          </w:p>
+        </w:tc>
+      </w:tr>
+      <w:tr>
+        <w:tc>
+          <w:tcPr>
+            <w:tcW w:type="dxa" w:w="4968"/>
+          </w:tcPr>
+          <w:p>
+            <w:r>
+              <w:t>Initial Git push returned HTTP 403</w:t>
+            </w:r>
+          </w:p>
+        </w:tc>
+        <w:tc>
+          <w:tcPr>
+            <w:tcW w:type="dxa" w:w="4968"/>
+          </w:tcPr>
+          <w:p>
+            <w:r>
+              <w:t>Repository access/authentication was corrected, after which main was pushed successfully.</w:t>
+            </w:r>
+          </w:p>
+        </w:tc>
+      </w:tr>
+      <w:tr>
+        <w:tc>
+          <w:tcPr>
+            <w:tcW w:type="dxa" w:w="4968"/>
+          </w:tcPr>
+          <w:p>
+            <w:r>
+              <w:t>Attempted push of master after branch rename</w:t>
+            </w:r>
+          </w:p>
+        </w:tc>
+        <w:tc>
+          <w:tcPr>
+            <w:tcW w:type="dxa" w:w="4968"/>
+          </w:tcPr>
+          <w:p>
+            <w:r>
+              <w:t>The local branch had been renamed to main; subsequent pushes correctly targeted main.</w:t>
+            </w:r>
+          </w:p>
+        </w:tc>
+      </w:tr>
+      <w:tr>
+        <w:tc>
+          <w:tcPr>
+            <w:tcW w:type="dxa" w:w="4968"/>
+          </w:tcPr>
+          <w:p>
+            <w:r>
+              <w:t>pytest not installed</w:t>
+            </w:r>
+          </w:p>
+        </w:tc>
+        <w:tc>
+          <w:tcPr>
+            <w:tcW w:type="dxa" w:w="4968"/>
+          </w:tcPr>
+          <w:p>
+            <w:r>
+              <w:t>pytest was added to requirements.txt and installed into the active .venv.</w:t>
+            </w:r>
+          </w:p>
+        </w:tc>
+      </w:tr>
+      <w:tr>
+        <w:tc>
+          <w:tcPr>
+            <w:tcW w:type="dxa" w:w="4968"/>
+          </w:tcPr>
+          <w:p>
+            <w:r>
+              <w:t>Missing run.py path</w:t>
+            </w:r>
+          </w:p>
+        </w:tc>
+        <w:tc>
+          <w:tcPr>
+            <w:tcW w:type="dxa" w:w="4968"/>
+          </w:tcPr>
+          <w:p>
+            <w:r>
+              <w:t>The correct current entry point is app/main.py.</w:t>
+            </w:r>
+          </w:p>
+        </w:tc>
+      </w:tr>
+      <w:tr>
+        <w:tc>
+          <w:tcPr>
+            <w:tcW w:type="dxa" w:w="4968"/>
+          </w:tcPr>
+          <w:p>
+            <w:r>
+              <w:t>PowerShell command concatenation</w:t>
+            </w:r>
+          </w:p>
+        </w:tc>
+        <w:tc>
+          <w:tcPr>
+            <w:tcW w:type="dxa" w:w="4968"/>
+          </w:tcPr>
+          <w:p>
+            <w:r>
+              <w:t>Commands were subsequently entered separately to avoid concatenation.</w:t>
+            </w:r>
+          </w:p>
+        </w:tc>
+      </w:tr>
+      <w:tr>
+        <w:tc>
+          <w:tcPr>
+            <w:tcW w:type="dxa" w:w="4968"/>
+          </w:tcPr>
+          <w:p>
+            <w:r>
+              <w:t>Environment templates initially empty</w:t>
+            </w:r>
+          </w:p>
+        </w:tc>
+        <w:tc>
+          <w:tcPr>
+            <w:tcW w:type="dxa" w:w="4968"/>
+          </w:tcPr>
+          <w:p>
+            <w:r>
+              <w:t>Root and environment example files were populated with explicit templates.</w:t>
+            </w:r>
+          </w:p>
+        </w:tc>
+      </w:tr>
+      <w:tr>
+        <w:tc>
+          <w:tcPr>
+            <w:tcW w:type="dxa" w:w="4968"/>
+          </w:tcPr>
+          <w:p>
+            <w:r>
+              <w:t>Invalid debug values</w:t>
+            </w:r>
+          </w:p>
+        </w:tc>
+        <w:tc>
+          <w:tcPr>
+            <w:tcW w:type="dxa" w:w="4968"/>
+          </w:tcPr>
+          <w:p>
+            <w:r>
+              <w:t>Configuration parsing was strengthened to raise ValueError for unsupported boolean strings.</w:t>
+            </w:r>
+          </w:p>
+        </w:tc>
+      </w:tr>
+    </w:tbl>
+    <w:p>
+      <w:pPr>
+        <w:pStyle w:val="Heading1"/>
+      </w:pPr>
+      <w:r>
+        <w:t>16. Engineering Decisions and Rationale</w:t>
+      </w:r>
+    </w:p>
+    <w:p>
+      <w:pPr>
+        <w:pStyle w:val="ListBullet"/>
+      </w:pPr>
+      <w:r>
+        <w:t>Use a layered application structure to separate infrastructure and service concerns.</w:t>
+      </w:r>
+    </w:p>
+    <w:p>
+      <w:pPr>
+        <w:pStyle w:val="ListBullet"/>
+      </w:pPr>
+      <w:r>
+        <w:t>Keep main.py thin so it does not become a monolithic control layer.</w:t>
+      </w:r>
+    </w:p>
+    <w:p>
+      <w:pPr>
+        <w:pStyle w:val="ListBullet"/>
+      </w:pPr>
+      <w:r>
+        <w:t>Use immutable configuration objects to prevent accidental mutation.</w:t>
+      </w:r>
+    </w:p>
+    <w:p>
+      <w:pPr>
+        <w:pStyle w:val="ListBullet"/>
+      </w:pPr>
+      <w:r>
+        <w:t>Fail fast on invalid configuration rather than silently accepting ambiguous values.</w:t>
+      </w:r>
+    </w:p>
+    <w:p>
+      <w:pPr>
+        <w:pStyle w:val="ListBullet"/>
+      </w:pPr>
+      <w:r>
+        <w:t>Use a standardized ServiceResult contract for predictable service responses.</w:t>
+      </w:r>
+    </w:p>
+    <w:p>
+      <w:pPr>
+        <w:pStyle w:val="ListBullet"/>
+      </w:pPr>
+      <w:r>
+        <w:t>Keep environment templates free of secrets and supply production credentials securely.</w:t>
+      </w:r>
+    </w:p>
+    <w:p>
+      <w:pPr>
+        <w:pStyle w:val="ListBullet"/>
+      </w:pPr>
+      <w:r>
+        <w:t>Treat automated tests as a verification gate before Git checkpoints.</w:t>
+      </w:r>
+    </w:p>
+    <w:p>
+      <w:pPr>
+        <w:pStyle w:val="ListBullet"/>
+      </w:pPr>
+      <w:r>
+        <w:t>Maintain one master documentation file per phase for clean historical records.</w:t>
+      </w:r>
+    </w:p>
+    <w:p>
+      <w:pPr>
+        <w:pStyle w:val="Heading1"/>
+      </w:pPr>
+      <w:r>
+        <w:t>17. Security Considerations</w:t>
+      </w:r>
+    </w:p>
+    <w:p>
+      <w:pPr>
+        <w:pStyle w:val="ListBullet"/>
+      </w:pPr>
+      <w:r>
+        <w:t>Never commit real secrets to the repository.</w:t>
+      </w:r>
+    </w:p>
+    <w:p>
+      <w:pPr>
+        <w:pStyle w:val="ListBullet"/>
+      </w:pPr>
+      <w:r>
+        <w:t>Inject production credentials through secure deployment configuration.</w:t>
+      </w:r>
+    </w:p>
+    <w:p>
+      <w:pPr>
+        <w:pStyle w:val="ListBullet"/>
+      </w:pPr>
+      <w:r>
+        <w:t>Keep debug mode disabled in production unless explicitly required and controlled.</w:t>
+      </w:r>
+    </w:p>
+    <w:p>
+      <w:pPr>
+        <w:pStyle w:val="ListBullet"/>
+      </w:pPr>
+      <w:r>
+        <w:t>Expand configuration validation as new environment variables are introduced.</w:t>
+      </w:r>
+    </w:p>
+    <w:p>
+      <w:pPr>
+        <w:pStyle w:val="ListBullet"/>
+      </w:pPr>
+      <w:r>
+        <w:t>Use dedicated secret management for future API keys, database credentials, authentication secrets, and third-party credentials.</w:t>
+      </w:r>
+    </w:p>
+    <w:p>
+      <w:pPr>
+        <w:pStyle w:val="Heading1"/>
+      </w:pPr>
+      <w:r>
+        <w:t>18. Performance and Scalability Considerations</w:t>
+      </w:r>
+    </w:p>
+    <w:p>
+      <w:pPr>
+        <w:pStyle w:val="ListBullet"/>
+      </w:pPr>
+      <w:r>
+        <w:t>The current application is lightweight with negligible startup overhead.</w:t>
+      </w:r>
+    </w:p>
+    <w:p>
+      <w:pPr>
+        <w:pStyle w:val="ListBullet"/>
+      </w:pPr>
+      <w:r>
+        <w:t>The service layer provides a boundary for future caching, asynchronous operations, and external integrations.</w:t>
+      </w:r>
+    </w:p>
+    <w:p>
+      <w:pPr>
+        <w:pStyle w:val="ListBullet"/>
+      </w:pPr>
+      <w:r>
+        <w:t>The immutable ServiceResult contract reduces ambiguity in service communication.</w:t>
+      </w:r>
+    </w:p>
+    <w:p>
+      <w:pPr>
+        <w:pStyle w:val="ListBullet"/>
+      </w:pPr>
+      <w:r>
+        <w:t>Performance optimisation should be driven by measured bottlenecks in later phases rather than premature complexity.</w:t>
+      </w:r>
+    </w:p>
+    <w:p>
+      <w:pPr>
+        <w:pStyle w:val="Heading1"/>
+      </w:pPr>
+      <w:r>
+        <w:t>19. Phase 2 Completion Checklist</w:t>
+      </w:r>
+    </w:p>
+    <w:tbl>
+      <w:tblPr>
+        <w:tblStyle w:val="TableGrid"/>
+        <w:tblW w:type="auto" w:w="0"/>
+        <w:jc w:val="center"/>
+        <w:tblLook w:firstColumn="1" w:firstRow="1" w:lastColumn="0" w:lastRow="0" w:noHBand="0" w:noVBand="1" w:val="04A0"/>
+      </w:tblPr>
+      <w:tblGrid>
+        <w:gridCol w:w="3312"/>
+        <w:gridCol w:w="3312"/>
+        <w:gridCol w:w="3312"/>
+      </w:tblGrid>
+      <w:tr>
+        <w:tc>
+          <w:tcPr>
+            <w:tcW w:type="dxa" w:w="3312"/>
+          </w:tcPr>
+          <w:p>
+            <w:r>
+              <w:rPr>
+                <w:b/>
+              </w:rPr>
+              <w:t>Status</w:t>
+            </w:r>
+          </w:p>
+        </w:tc>
+        <w:tc>
+          <w:tcPr>
+            <w:tcW w:type="dxa" w:w="3312"/>
+          </w:tcPr>
+          <w:p>
+            <w:r>
+              <w:rPr>
+                <w:b/>
+              </w:rPr>
+              <w:t>Requirement</w:t>
+            </w:r>
+          </w:p>
+        </w:tc>
+        <w:tc>
+          <w:tcPr>
+            <w:tcW w:type="dxa" w:w="3312"/>
+          </w:tcPr>
+          <w:p>
+            <w:r>
+              <w:rPr>
+                <w:b/>
+              </w:rPr>
+              <w:t>Result</w:t>
+            </w:r>
+          </w:p>
+        </w:tc>
+      </w:tr>
+      <w:tr>
+        <w:tc>
+          <w:tcPr>
+            <w:tcW w:type="dxa" w:w="3312"/>
+          </w:tcPr>
+          <w:p>
+            <w:r>
+              <w:t>✓</w:t>
+            </w:r>
+          </w:p>
+        </w:tc>
+        <w:tc>
+          <w:tcPr>
+            <w:tcW w:type="dxa" w:w="3312"/>
+          </w:tcPr>
+          <w:p>
+            <w:r>
+              <w:t>Project skeleton established</w:t>
+            </w:r>
+          </w:p>
+        </w:tc>
+        <w:tc>
+          <w:tcPr>
+            <w:tcW w:type="dxa" w:w="3312"/>
+          </w:tcPr>
+          <w:p>
+            <w:r>
+              <w:t>Complete</w:t>
+            </w:r>
+          </w:p>
+        </w:tc>
+      </w:tr>
+      <w:tr>
+        <w:tc>
+          <w:tcPr>
+            <w:tcW w:type="dxa" w:w="3312"/>
+          </w:tcPr>
+          <w:p>
+            <w:r>
+              <w:t>✓</w:t>
+            </w:r>
+          </w:p>
+        </w:tc>
+        <w:tc>
+          <w:tcPr>
+            <w:tcW w:type="dxa" w:w="3312"/>
+          </w:tcPr>
+          <w:p>
+            <w:r>
+              <w:t>Core configuration implemented</w:t>
+            </w:r>
+          </w:p>
+        </w:tc>
+        <w:tc>
+          <w:tcPr>
+            <w:tcW w:type="dxa" w:w="3312"/>
+          </w:tcPr>
+          <w:p>
+            <w:r>
+              <w:t>Complete</w:t>
+            </w:r>
+          </w:p>
+        </w:tc>
+      </w:tr>
+      <w:tr>
+        <w:tc>
+          <w:tcPr>
+            <w:tcW w:type="dxa" w:w="3312"/>
+          </w:tcPr>
+          <w:p>
+            <w:r>
+              <w:t>✓</w:t>
+            </w:r>
+          </w:p>
+        </w:tc>
+        <w:tc>
+          <w:tcPr>
+            <w:tcW w:type="dxa" w:w="3312"/>
+          </w:tcPr>
+          <w:p>
+            <w:r>
+              <w:t>Project metadata centralized</w:t>
+            </w:r>
+          </w:p>
+        </w:tc>
+        <w:tc>
+          <w:tcPr>
+            <w:tcW w:type="dxa" w:w="3312"/>
+          </w:tcPr>
+          <w:p>
+            <w:r>
+              <w:t>Complete</w:t>
+            </w:r>
+          </w:p>
+        </w:tc>
+      </w:tr>
+      <w:tr>
+        <w:tc>
+          <w:tcPr>
+            <w:tcW w:type="dxa" w:w="3312"/>
+          </w:tcPr>
+          <w:p>
+            <w:r>
+              <w:t>✓</w:t>
+            </w:r>
+          </w:p>
+        </w:tc>
+        <w:tc>
+          <w:tcPr>
+            <w:tcW w:type="dxa" w:w="3312"/>
+          </w:tcPr>
+          <w:p>
+            <w:r>
+              <w:t>Project root path utility implemented</w:t>
+            </w:r>
+          </w:p>
+        </w:tc>
+        <w:tc>
+          <w:tcPr>
+            <w:tcW w:type="dxa" w:w="3312"/>
+          </w:tcPr>
+          <w:p>
+            <w:r>
+              <w:t>Complete</w:t>
+            </w:r>
+          </w:p>
+        </w:tc>
+      </w:tr>
+      <w:tr>
+        <w:tc>
+          <w:tcPr>
+            <w:tcW w:type="dxa" w:w="3312"/>
+          </w:tcPr>
+          <w:p>
+            <w:r>
+              <w:t>✓</w:t>
+            </w:r>
+          </w:p>
+        </w:tc>
+        <w:tc>
+          <w:tcPr>
+            <w:tcW w:type="dxa" w:w="3312"/>
+          </w:tcPr>
+          <w:p>
+            <w:r>
+              <w:t>Logging initialization integrated</w:t>
+            </w:r>
+          </w:p>
+        </w:tc>
+        <w:tc>
+          <w:tcPr>
+            <w:tcW w:type="dxa" w:w="3312"/>
+          </w:tcPr>
+          <w:p>
+            <w:r>
+              <w:t>Complete</w:t>
+            </w:r>
+          </w:p>
+        </w:tc>
+      </w:tr>
+      <w:tr>
+        <w:tc>
+          <w:tcPr>
+            <w:tcW w:type="dxa" w:w="3312"/>
+          </w:tcPr>
+          <w:p>
+            <w:r>
+              <w:t>✓</w:t>
+            </w:r>
+          </w:p>
+        </w:tc>
+        <w:tc>
+          <w:tcPr>
+            <w:tcW w:type="dxa" w:w="3312"/>
+          </w:tcPr>
+          <w:p>
+            <w:r>
+              <w:t>Environment templates created</w:t>
+            </w:r>
+          </w:p>
+        </w:tc>
+        <w:tc>
+          <w:tcPr>
+            <w:tcW w:type="dxa" w:w="3312"/>
+          </w:tcPr>
+          <w:p>
+            <w:r>
+              <w:t>Complete</w:t>
+            </w:r>
+          </w:p>
+        </w:tc>
+      </w:tr>
+      <w:tr>
+        <w:tc>
+          <w:tcPr>
+            <w:tcW w:type="dxa" w:w="3312"/>
+          </w:tcPr>
+          <w:p>
+            <w:r>
+              <w:t>✓</w:t>
+            </w:r>
+          </w:p>
+        </w:tc>
+        <w:tc>
+          <w:tcPr>
+            <w:tcW w:type="dxa" w:w="3312"/>
+          </w:tcPr>
+          <w:p>
+            <w:r>
+              <w:t>pytest installed and configured</w:t>
+            </w:r>
+          </w:p>
+        </w:tc>
+        <w:tc>
+          <w:tcPr>
+            <w:tcW w:type="dxa" w:w="3312"/>
+          </w:tcPr>
+          <w:p>
+            <w:r>
+              <w:t>Complete</w:t>
+            </w:r>
+          </w:p>
+        </w:tc>
+      </w:tr>
+      <w:tr>
+        <w:tc>
+          <w:tcPr>
+            <w:tcW w:type="dxa" w:w="3312"/>
+          </w:tcPr>
+          <w:p>
+            <w:r>
+              <w:t>✓</w:t>
+            </w:r>
+          </w:p>
+        </w:tc>
+        <w:tc>
+          <w:tcPr>
+            <w:tcW w:type="dxa" w:w="3312"/>
+          </w:tcPr>
+          <w:p>
+            <w:r>
+              <w:t>Configuration tests implemented</w:t>
+            </w:r>
+          </w:p>
+        </w:tc>
+        <w:tc>
+          <w:tcPr>
+            <w:tcW w:type="dxa" w:w="3312"/>
+          </w:tcPr>
+          <w:p>
+            <w:r>
+              <w:t>Complete</w:t>
+            </w:r>
+          </w:p>
+        </w:tc>
+      </w:tr>
+      <w:tr>
+        <w:tc>
+          <w:tcPr>
+            <w:tcW w:type="dxa" w:w="3312"/>
+          </w:tcPr>
+          <w:p>
+            <w:r>
+              <w:t>✓</w:t>
+            </w:r>
+          </w:p>
+        </w:tc>
+        <w:tc>
+          <w:tcPr>
+            <w:tcW w:type="dxa" w:w="3312"/>
+          </w:tcPr>
+          <w:p>
+            <w:r>
+              <w:t>System service implemented</w:t>
+            </w:r>
+          </w:p>
+        </w:tc>
+        <w:tc>
+          <w:tcPr>
+            <w:tcW w:type="dxa" w:w="3312"/>
+          </w:tcPr>
+          <w:p>
+            <w:r>
+              <w:t>Complete</w:t>
+            </w:r>
+          </w:p>
+        </w:tc>
+      </w:tr>
+      <w:tr>
+        <w:tc>
+          <w:tcPr>
+            <w:tcW w:type="dxa" w:w="3312"/>
+          </w:tcPr>
+          <w:p>
+            <w:r>
+              <w:t>✓</w:t>
+            </w:r>
+          </w:p>
+        </w:tc>
+        <w:tc>
+          <w:tcPr>
+            <w:tcW w:type="dxa" w:w="3312"/>
+          </w:tcPr>
+          <w:p>
+            <w:r>
+              <w:t>ServiceResult contract implemented</w:t>
+            </w:r>
+          </w:p>
+        </w:tc>
+        <w:tc>
+          <w:tcPr>
+            <w:tcW w:type="dxa" w:w="3312"/>
+          </w:tcPr>
+          <w:p>
+            <w:r>
+              <w:t>Complete</w:t>
+            </w:r>
+          </w:p>
+        </w:tc>
+      </w:tr>
+      <w:tr>
+        <w:tc>
+          <w:tcPr>
+            <w:tcW w:type="dxa" w:w="3312"/>
+          </w:tcPr>
+          <w:p>
+            <w:r>
+              <w:t>✓</w:t>
+            </w:r>
+          </w:p>
+        </w:tc>
+        <w:tc>
+          <w:tcPr>
+            <w:tcW w:type="dxa" w:w="3312"/>
+          </w:tcPr>
+          <w:p>
+            <w:r>
+              <w:t>Service-layer tests implemented</w:t>
+            </w:r>
+          </w:p>
+        </w:tc>
+        <w:tc>
+          <w:tcPr>
+            <w:tcW w:type="dxa" w:w="3312"/>
+          </w:tcPr>
+          <w:p>
+            <w:r>
+              <w:t>Complete</w:t>
+            </w:r>
+          </w:p>
+        </w:tc>
+      </w:tr>
+      <w:tr>
+        <w:tc>
+          <w:tcPr>
+            <w:tcW w:type="dxa" w:w="3312"/>
+          </w:tcPr>
+          <w:p>
+            <w:r>
+              <w:t>✓</w:t>
+            </w:r>
+          </w:p>
+        </w:tc>
+        <w:tc>
+          <w:tcPr>
+            <w:tcW w:type="dxa" w:w="3312"/>
+          </w:tcPr>
+          <w:p>
+            <w:r>
+              <w:t>Application startup verified</w:t>
+            </w:r>
+          </w:p>
+        </w:tc>
+        <w:tc>
+          <w:tcPr>
+            <w:tcW w:type="dxa" w:w="3312"/>
+          </w:tcPr>
+          <w:p>
+            <w:r>
+              <w:t>Complete</w:t>
+            </w:r>
+          </w:p>
+        </w:tc>
+      </w:tr>
+      <w:tr>
+        <w:tc>
+          <w:tcPr>
+            <w:tcW w:type="dxa" w:w="3312"/>
+          </w:tcPr>
+          <w:p>
+            <w:r>
+              <w:t>✓</w:t>
+            </w:r>
+          </w:p>
+        </w:tc>
+        <w:tc>
+          <w:tcPr>
+            <w:tcW w:type="dxa" w:w="3312"/>
+          </w:tcPr>
+          <w:p>
+            <w:r>
+              <w:t>23 automated tests passing</w:t>
+            </w:r>
+          </w:p>
+        </w:tc>
+        <w:tc>
+          <w:tcPr>
+            <w:tcW w:type="dxa" w:w="3312"/>
+          </w:tcPr>
+          <w:p>
+            <w:r>
+              <w:t>Complete</w:t>
+            </w:r>
+          </w:p>
+        </w:tc>
+      </w:tr>
+      <w:tr>
+        <w:tc>
+          <w:tcPr>
+            <w:tcW w:type="dxa" w:w="3312"/>
+          </w:tcPr>
+          <w:p>
+            <w:r>
+              <w:t>✓</w:t>
+            </w:r>
+          </w:p>
+        </w:tc>
+        <w:tc>
+          <w:tcPr>
+            <w:tcW w:type="dxa" w:w="3312"/>
+          </w:tcPr>
+          <w:p>
+            <w:r>
+              <w:t>git diff --check passed</w:t>
+            </w:r>
+          </w:p>
+        </w:tc>
+        <w:tc>
+          <w:tcPr>
+            <w:tcW w:type="dxa" w:w="3312"/>
+          </w:tcPr>
+          <w:p>
+            <w:r>
+              <w:t>Complete</w:t>
+            </w:r>
+          </w:p>
+        </w:tc>
+      </w:tr>
+      <w:tr>
+        <w:tc>
+          <w:tcPr>
+            <w:tcW w:type="dxa" w:w="3312"/>
+          </w:tcPr>
+          <w:p>
+            <w:r>
+              <w:t>✓</w:t>
+            </w:r>
+          </w:p>
+        </w:tc>
+        <w:tc>
+          <w:tcPr>
+            <w:tcW w:type="dxa" w:w="3312"/>
+          </w:tcPr>
+          <w:p>
+            <w:r>
+              <w:t>Git commits pushed to origin/main</w:t>
+            </w:r>
+          </w:p>
+        </w:tc>
+        <w:tc>
+          <w:tcPr>
+            <w:tcW w:type="dxa" w:w="3312"/>
+          </w:tcPr>
+          <w:p>
+            <w:r>
+              <w:t>Complete</w:t>
+            </w:r>
+          </w:p>
+        </w:tc>
+      </w:tr>
+      <w:tr>
+        <w:tc>
+          <w:tcPr>
+            <w:tcW w:type="dxa" w:w="3312"/>
+          </w:tcPr>
+          <w:p>
+            <w:r>
+              <w:t>✓</w:t>
+            </w:r>
+          </w:p>
+        </w:tc>
+        <w:tc>
+          <w:tcPr>
+            <w:tcW w:type="dxa" w:w="3312"/>
+          </w:tcPr>
+          <w:p>
+            <w:r>
+              <w:t>Phase 2 documentation created</w:t>
+            </w:r>
+          </w:p>
+        </w:tc>
+        <w:tc>
+          <w:tcPr>
+            <w:tcW w:type="dxa" w:w="3312"/>
+          </w:tcPr>
+          <w:p>
+            <w:r>
+              <w:t>Complete</w:t>
+            </w:r>
+          </w:p>
+        </w:tc>
+      </w:tr>
+    </w:tbl>
+    <w:p>
+      <w:pPr>
+        <w:pStyle w:val="Heading1"/>
+      </w:pPr>
+      <w:r>
+        <w:t>20. Phase 2 Final Status</w:t>
+      </w:r>
+    </w:p>
+    <w:p>
+      <w:r>
+        <w:t>Phase 2 is considered implementation-complete based on the recorded verification results. The application skeleton, configuration layer, service layer, standardized service-result contract, automated tests, environment templates, and Git checkpoints are in place.</w:t>
+      </w:r>
+    </w:p>
+    <w:p>
+      <w:r>
+        <w:t>The project is ready to proceed to the next planned development phase once the Phase 2 scope is frozen and the next phase objectives are approved.</w:t>
+      </w:r>
+    </w:p>
+    <w:p>
+      <w:pPr>
+        <w:pStyle w:val="Heading1"/>
+      </w:pPr>
+      <w:r>
+        <w:t>21. Next Phase Readiness</w:t>
+      </w:r>
+    </w:p>
+    <w:p>
+      <w:pPr>
+        <w:pStyle w:val="ListBullet"/>
+      </w:pPr>
+      <w:r>
+        <w:t>The main branch is clean and synchronized with origin/main.</w:t>
+      </w:r>
+    </w:p>
+    <w:p>
+      <w:pPr>
+        <w:pStyle w:val="ListBullet"/>
+      </w:pPr>
+      <w:r>
+        <w:t>The complete test suite passes.</w:t>
+      </w:r>
+    </w:p>
+    <w:p>
+      <w:pPr>
+        <w:pStyle w:val="ListBullet"/>
+      </w:pPr>
+      <w:r>
+        <w:t>The Phase 2 master documentation is committed to the repository.</w:t>
+      </w:r>
+    </w:p>
+    <w:p>
+      <w:pPr>
+        <w:pStyle w:val="ListBullet"/>
+      </w:pPr>
+      <w:r>
+        <w:t>No secrets are present in tracked configuration templates.</w:t>
+      </w:r>
+    </w:p>
+    <w:p>
+      <w:pPr>
+        <w:pStyle w:val="ListBullet"/>
+      </w:pPr>
+      <w:r>
+        <w:t>The next phase has a defined scope, acceptance criteria, and its own documentation file.</w:t>
+      </w:r>
+    </w:p>
+    <w:p>
+      <w:pPr>
+        <w:pStyle w:val="Heading1"/>
+      </w:pPr>
+      <w:r>
+        <w:t>22. Documentation Standard for Future Phases</w:t>
+      </w:r>
+    </w:p>
+    <w:p>
+      <w:r>
+        <w:t>From this point forward, each NOVYRA OS development phase will have a dedicated master documentation file stored under 00_PROJECT_DOCUMENTATION. Each phase document should record objectives, scope, architecture, implementation steps, files changed, configuration, tests, errors and resolutions, Git checkpoints, security considerations, performance considerations, decisions, completion criteria, and next-phase readiness.</w:t>
+      </w:r>
+    </w:p>
+    <w:p>
+      <w:pPr>
+        <w:ind w:left="360"/>
+      </w:pPr>
+      <w:r>
+        <w:rPr>
+          <w:rFonts w:ascii="Consolas" w:hAnsi="Consolas"/>
+          <w:sz w:val="18"/>
+        </w:rPr>
+        <w:t>00_PROJECT_DOCUMENTATION/</w:t>
+        <w:br/>
+        <w:t>├── Phase_1_Project_Foundation/</w:t>
+        <w:br/>
+        <w:t>│   └── NOVYRA_OS_Phase_1_Master_Documentation.docx</w:t>
+        <w:br/>
+        <w:t>├── Phase_2_Core_Application_Skeleton/</w:t>
+        <w:br/>
+        <w:t>│   └── NOVYRA_OS_Phase_2_Master_Documentation.docx</w:t>
+        <w:br/>
+        <w:t>├── Phase_3_[Phase_Name]/</w:t>
+        <w:br/>
+        <w:t>│   └── NOVYRA_OS_Phase_3_Master_Documentation.docx</w:t>
+        <w:br/>
+        <w:t>└── ...</w:t>
+      </w:r>
+    </w:p>
+    <w:p>
+      <w:pPr>
+        <w:pStyle w:val="Heading1"/>
+      </w:pPr>
+      <w:r>
+        <w:t>23. Change Log</w:t>
+      </w:r>
+    </w:p>
+    <w:tbl>
+      <w:tblPr>
+        <w:tblStyle w:val="TableGrid"/>
+        <w:tblW w:type="auto" w:w="0"/>
+        <w:jc w:val="center"/>
+        <w:tblLook w:firstColumn="1" w:firstRow="1" w:lastColumn="0" w:lastRow="0" w:noHBand="0" w:noVBand="1" w:val="04A0"/>
+      </w:tblPr>
+      <w:tblGrid>
+        <w:gridCol w:w="3312"/>
+        <w:gridCol w:w="3312"/>
+        <w:gridCol w:w="3312"/>
+      </w:tblGrid>
+      <w:tr>
+        <w:tc>
+          <w:tcPr>
+            <w:tcW w:type="dxa" w:w="3312"/>
+          </w:tcPr>
+          <w:p>
+            <w:r>
+              <w:rPr>
+                <w:b/>
+              </w:rPr>
+              <w:t>Revision</w:t>
+            </w:r>
+          </w:p>
+        </w:tc>
+        <w:tc>
+          <w:tcPr>
+            <w:tcW w:type="dxa" w:w="3312"/>
+          </w:tcPr>
+          <w:p>
+            <w:r>
+              <w:rPr>
+                <w:b/>
+              </w:rPr>
+              <w:t>Date</w:t>
+            </w:r>
+          </w:p>
+        </w:tc>
+        <w:tc>
+          <w:tcPr>
+            <w:tcW w:type="dxa" w:w="3312"/>
+          </w:tcPr>
+          <w:p>
+            <w:r>
+              <w:rPr>
+                <w:b/>
+              </w:rPr>
+              <w:t>Change</w:t>
+            </w:r>
+          </w:p>
+        </w:tc>
+      </w:tr>
+      <w:tr>
+        <w:tc>
+          <w:tcPr>
+            <w:tcW w:type="dxa" w:w="3312"/>
+          </w:tcPr>
+          <w:p>
+            <w:r>
+              <w:t>1.0</w:t>
+            </w:r>
+          </w:p>
+        </w:tc>
+        <w:tc>
+          <w:tcPr>
+            <w:tcW w:type="dxa" w:w="3312"/>
+          </w:tcPr>
+          <w:p>
+            <w:r>
+              <w:t>26 July 2026</w:t>
+            </w:r>
+          </w:p>
+        </w:tc>
+        <w:tc>
+          <w:tcPr>
+            <w:tcW w:type="dxa" w:w="3312"/>
+          </w:tcPr>
+          <w:p>
+            <w:r>
+              <w:t>Created standalone Phase 2 master documentation covering the core application skeleton and verified implementation state.</w:t>
+            </w:r>
+          </w:p>
+        </w:tc>
+      </w:tr>
+    </w:tbl>
+    <w:p>
+      <w:pPr>
+        <w:pStyle w:val="Heading1"/>
+      </w:pPr>
+      <w:r>
+        <w:t>24. Document Governance</w:t>
+      </w:r>
+    </w:p>
+    <w:p>
+      <w:r>
+        <w:t>This document should be updated whenever Phase 2 implementation details materially change. Once Phase 2 is formally closed, this file becomes the historical baseline. Future phases must use their own master documentation files and must not overwrite this record.</w:t>
       </w:r>
     </w:p>
     <w:sectPr>
       <w:footerReference w:type="default" r:id="rId9"/>
       <w:pgSz w:w="12240" w:h="15840"/>
-      <w:pgMar w:top="1152" w:right="1296" w:bottom="1008" w:left="1296" w:header="720" w:footer="720" w:gutter="0"/>
+      <w:pgMar w:top="1008" w:right="1152" w:bottom="1008" w:left="1152" w:header="720" w:footer="720" w:gutter="0"/>
       <w:cols w:space="720"/>
       <w:docGrid w:linePitch="360"/>
     </w:sectPr>
@@ -1134,10 +3116,12 @@
       <w:jc w:val="center"/>
     </w:pPr>
     <w:r>
-      <w:rPr>
-        <w:sz w:val="17"/>
-      </w:rPr>
-      <w:t>NOVYRA OS — Phase 2 Master Documentation</w:t>
+      <w:t xml:space="preserve">NOVYRA OS — Phase 2 Master Documentation | </w:t>
+    </w:r>
+    <w:r>
+      <w:fldChar w:fldCharType="begin"/>
+      <w:instrText xml:space="preserve">PAGE</w:instrText>
+      <w:fldChar w:fldCharType="end"/>
     </w:r>
   </w:p>
 </w:ftr>
@@ -1574,7 +3558,7 @@
       <w:b/>
       <w:bCs/>
       <w:color w:val="365F91" w:themeColor="accent1" w:themeShade="BF"/>
-      <w:sz w:val="28"/>
+      <w:sz w:val="32"/>
       <w:szCs w:val="28"/>
     </w:rPr>
   </w:style>
@@ -1863,7 +3847,7 @@
       <w:color w:val="17365D" w:themeColor="text2" w:themeShade="BF"/>
       <w:spacing w:val="5"/>
       <w:kern w:val="28"/>
-      <w:sz w:val="52"/>
+      <w:sz w:val="48"/>
       <w:szCs w:val="52"/>
     </w:rPr>
   </w:style>
@@ -1896,7 +3880,7 @@
       </w:numPr>
     </w:pPr>
     <w:rPr>
-      <w:rFonts w:asciiTheme="majorHAnsi" w:eastAsiaTheme="majorEastAsia" w:hAnsiTheme="majorHAnsi" w:cstheme="majorBidi" w:ascii="Aptos" w:hAnsi="Aptos"/>
+      <w:rFonts w:asciiTheme="majorHAnsi" w:eastAsiaTheme="majorEastAsia" w:hAnsiTheme="majorHAnsi" w:cstheme="majorBidi"/>
       <w:i/>
       <w:iCs/>
       <w:color w:val="4F81BD" w:themeColor="accent1"/>

</xml_diff>